<commit_message>
Report: add deployment and monitoring screenshots, rebuild docx (10 pages)
- Insert CI, Docker, Kubernetes, HPA, Prometheus and Grafana screenshots
- Describe the Rocky Linux minikube deployment and the 2 -> 4 HPA scale-out
- Compact A4 layout (reference.docx) and paired figures: 20 -> 10 pages
- Add PDF export and a 'make report' target
- Fix screenshot filename typos

Co-Authored-By: Claude Opus 5.5 <noreply@anthropic.com>
</commit_message>
<xml_diff>
--- a/reports/MLOps_Assignment1_Report.docx
+++ b/reports/MLOps_Assignment1_Report.docx
@@ -40,32 +40,6 @@
         <w:t xml:space="preserve">October 2026</w:t>
       </w:r>
     </w:p>
-    <w:sdt>
-      <w:sdtPr>
-        <w:docPartObj>
-          <w:docPartGallery w:val="Table of Contents"/>
-          <w:docPartUnique/>
-        </w:docPartObj>
-      </w:sdtPr>
-      <w:sdtContent>
-        <w:p>
-          <w:pPr>
-            <w:pStyle w:val="TOCHeading"/>
-          </w:pPr>
-          <w:r>
-            <w:t xml:space="preserve">Table of Contents</w:t>
-          </w:r>
-        </w:p>
-        <w:p>
-          <w:r>
-            <w:fldChar w:fldCharType="begin" w:dirty="true"/>
-            <w:instrText xml:space="preserve">TOC \o "1-3" \h \z \u</w:instrText>
-            <w:fldChar w:fldCharType="separate"/>
-            <w:fldChar w:fldCharType="end"/>
-          </w:r>
-        </w:p>
-      </w:sdtContent>
-    </w:sdt>
     <w:p>
       <w:pPr>
         <w:pStyle w:val="FirstParagraph"/>
@@ -80,12 +54,14 @@
       <w:r>
         <w:t xml:space="preserve"> </w:t>
       </w:r>
-      <w:r>
-        <w:rPr>
-          <w:rStyle w:val="VerbatimChar"/>
-        </w:rPr>
-        <w:t xml:space="preserve">&lt;add your GitHub URL here&gt;</w:t>
-      </w:r>
+      <w:hyperlink r:id="rId61">
+        <w:r>
+          <w:rPr>
+            <w:rStyle w:val="Hyperlink"/>
+          </w:rPr>
+          <w:t xml:space="preserve">github.com/bhargavaankit/heart-risk-mlops</w:t>
+        </w:r>
+      </w:hyperlink>
       <w:r>
         <w:br/>
       </w:r>
@@ -100,7 +76,7 @@
         <w:t xml:space="preserve"> </w:t>
       </w:r>
       <w:r>
-        <w:t xml:space="preserve">local Kubernetes (Colima k3s). Access instructions are in §7.</w:t>
+        <w:t xml:space="preserve">local Kubernetes (minikube, Docker driver) on the Rocky Linux 9.5 lab server, also verified on Windows. Access instructions are in §7.</w:t>
       </w:r>
       <w:r>
         <w:br/>
@@ -122,7 +98,7 @@
         <w:t xml:space="preserve">&lt;add link&gt;</w:t>
       </w:r>
     </w:p>
-    <w:bookmarkStart w:id="12" w:name="overview"/>
+    <w:bookmarkStart w:id="65" w:name="overview"/>
     <w:p>
       <w:pPr>
         <w:pStyle w:val="Heading1"/>
@@ -221,20 +197,20 @@
       <w:r>
         <w:drawing>
           <wp:inline>
-            <wp:extent cx="5334000" cy="2533650"/>
+            <wp:extent cx="4480560" cy="2128266"/>
             <wp:effectExtent b="0" l="0" r="0" t="0"/>
-            <wp:docPr descr="Figure 1 – System architecture" title="" id="10" name="Picture"/>
+            <wp:docPr descr="Figure 1 – System architecture" title="" id="63" name="Picture"/>
             <a:graphic>
               <a:graphicData uri="http://schemas.openxmlformats.org/drawingml/2006/picture">
                 <pic:pic>
                   <pic:nvPicPr>
-                    <pic:cNvPr descr="figures/arch/architecture.png" id="11" name="Picture"/>
+                    <pic:cNvPr descr="figures/arch/architecture.png" id="64" name="Picture"/>
                     <pic:cNvPicPr>
                       <a:picLocks noChangeArrowheads="1" noChangeAspect="1"/>
                     </pic:cNvPicPr>
                   </pic:nvPicPr>
                   <pic:blipFill>
-                    <a:blip r:embed="rId9"/>
+                    <a:blip r:embed="rId62"/>
                     <a:stretch>
                       <a:fillRect/>
                     </a:stretch>
@@ -242,7 +218,7 @@
                   <pic:spPr bwMode="auto">
                     <a:xfrm>
                       <a:off x="0" y="0"/>
-                      <a:ext cx="5334000" cy="2533650"/>
+                      <a:ext cx="4480560" cy="2128266"/>
                     </a:xfrm>
                     <a:prstGeom prst="rect">
                       <a:avLst/>
@@ -383,8 +359,8 @@
         <w:t xml:space="preserve">The 20 % hold-out set is touched once, to report an unbiased estimate. It is never used to choose a model.</w:t>
       </w:r>
     </w:p>
-    <w:bookmarkEnd w:id="12"/>
-    <w:bookmarkStart w:id="32" w:name="data-acquisition-and-eda"/>
+    <w:bookmarkEnd w:id="65"/>
+    <w:bookmarkStart w:id="85" w:name="data-acquisition-and-eda"/>
     <w:p>
       <w:pPr>
         <w:pStyle w:val="Heading1"/>
@@ -393,7 +369,7 @@
         <w:t xml:space="preserve">2. Data acquisition and EDA</w:t>
       </w:r>
     </w:p>
-    <w:bookmarkStart w:id="13" w:name="acquisition"/>
+    <w:bookmarkStart w:id="66" w:name="acquisition"/>
     <w:p>
       <w:pPr>
         <w:pStyle w:val="Heading2"/>
@@ -494,8 +470,8 @@
         <w:t xml:space="preserve">. The download is skipped when the files already exist, so the step is idempotent.</w:t>
       </w:r>
     </w:p>
-    <w:bookmarkEnd w:id="13"/>
-    <w:bookmarkStart w:id="17" w:name="choosing-the-subset"/>
+    <w:bookmarkEnd w:id="66"/>
+    <w:bookmarkStart w:id="70" w:name="choosing-the-subset"/>
     <w:p>
       <w:pPr>
         <w:pStyle w:val="Heading2"/>
@@ -571,20 +547,20 @@
       <w:r>
         <w:drawing>
           <wp:inline>
-            <wp:extent cx="5334000" cy="1706880"/>
+            <wp:extent cx="4480560" cy="1433779"/>
             <wp:effectExtent b="0" l="0" r="0" t="0"/>
-            <wp:docPr descr="Figure 2 – Missingness per site after cleaning" title="" id="15" name="Picture"/>
+            <wp:docPr descr="Figure 2 – Missingness per site after cleaning" title="" id="68" name="Picture"/>
             <a:graphic>
               <a:graphicData uri="http://schemas.openxmlformats.org/drawingml/2006/picture">
                 <pic:pic>
                   <pic:nvPicPr>
-                    <pic:cNvPr descr="figures/eda/07_missingness_by_source.png" id="16" name="Picture"/>
+                    <pic:cNvPr descr="figures/eda/07_missingness_by_source.png" id="69" name="Picture"/>
                     <pic:cNvPicPr>
                       <a:picLocks noChangeArrowheads="1" noChangeAspect="1"/>
                     </pic:cNvPicPr>
                   </pic:nvPicPr>
                   <pic:blipFill>
-                    <a:blip r:embed="rId14"/>
+                    <a:blip r:embed="rId67"/>
                     <a:stretch>
                       <a:fillRect/>
                     </a:stretch>
@@ -592,7 +568,7 @@
                   <pic:spPr bwMode="auto">
                     <a:xfrm>
                       <a:off x="0" y="0"/>
-                      <a:ext cx="5334000" cy="1706880"/>
+                      <a:ext cx="4480560" cy="1433779"/>
                     </a:xfrm>
                     <a:prstGeom prst="rect">
                       <a:avLst/>
@@ -619,8 +595,8 @@
         <w:t xml:space="preserve">Figure 2 – Missingness per site after cleaning</w:t>
       </w:r>
     </w:p>
-    <w:bookmarkEnd w:id="17"/>
-    <w:bookmarkStart w:id="18" w:name="cleaning"/>
+    <w:bookmarkEnd w:id="70"/>
+    <w:bookmarkStart w:id="71" w:name="cleaning"/>
     <w:p>
       <w:pPr>
         <w:pStyle w:val="Heading2"/>
@@ -935,8 +911,8 @@
         <w:t xml:space="preserve">. Everything else is complete.</w:t>
       </w:r>
     </w:p>
-    <w:bookmarkEnd w:id="18"/>
-    <w:bookmarkStart w:id="31" w:name="findings"/>
+    <w:bookmarkEnd w:id="71"/>
+    <w:bookmarkStart w:id="84" w:name="findings"/>
     <w:p>
       <w:pPr>
         <w:pStyle w:val="Heading2"/>
@@ -960,20 +936,20 @@
       <w:r>
         <w:drawing>
           <wp:inline>
-            <wp:extent cx="2400300" cy="1866900"/>
+            <wp:extent cx="2240280" cy="1742440"/>
             <wp:effectExtent b="0" l="0" r="0" t="0"/>
-            <wp:docPr descr="Figure 3 – Class balance" title="" id="20" name="Picture"/>
+            <wp:docPr descr="Figure 3 – Class balance" title="" id="73" name="Picture"/>
             <a:graphic>
               <a:graphicData uri="http://schemas.openxmlformats.org/drawingml/2006/picture">
                 <pic:pic>
                   <pic:nvPicPr>
-                    <pic:cNvPr descr="figures/eda/01_class_balance.png" id="21" name="Picture"/>
+                    <pic:cNvPr descr="figures/eda/01_class_balance.png" id="74" name="Picture"/>
                     <pic:cNvPicPr>
                       <a:picLocks noChangeArrowheads="1" noChangeAspect="1"/>
                     </pic:cNvPicPr>
                   </pic:nvPicPr>
                   <pic:blipFill>
-                    <a:blip r:embed="rId19"/>
+                    <a:blip r:embed="rId72"/>
                     <a:stretch>
                       <a:fillRect/>
                     </a:stretch>
@@ -981,7 +957,7 @@
                   <pic:spPr bwMode="auto">
                     <a:xfrm>
                       <a:off x="0" y="0"/>
-                      <a:ext cx="2400300" cy="1866900"/>
+                      <a:ext cx="2240280" cy="1742440"/>
                     </a:xfrm>
                     <a:prstGeom prst="rect">
                       <a:avLst/>
@@ -1015,20 +991,20 @@
       <w:r>
         <w:drawing>
           <wp:inline>
-            <wp:extent cx="5334000" cy="2889250"/>
+            <wp:extent cx="4608576" cy="2496312"/>
             <wp:effectExtent b="0" l="0" r="0" t="0"/>
-            <wp:docPr descr="Figure 4 – Numeric features by diagnosis" title="" id="23" name="Picture"/>
+            <wp:docPr descr="Figure 4 – Numeric features by diagnosis" title="" id="76" name="Picture"/>
             <a:graphic>
               <a:graphicData uri="http://schemas.openxmlformats.org/drawingml/2006/picture">
                 <pic:pic>
                   <pic:nvPicPr>
-                    <pic:cNvPr descr="figures/eda/02_numeric_histograms.png" id="24" name="Picture"/>
+                    <pic:cNvPr descr="figures/eda/02_numeric_histograms.png" id="77" name="Picture"/>
                     <pic:cNvPicPr>
                       <a:picLocks noChangeArrowheads="1" noChangeAspect="1"/>
                     </pic:cNvPicPr>
                   </pic:nvPicPr>
                   <pic:blipFill>
-                    <a:blip r:embed="rId22"/>
+                    <a:blip r:embed="rId75"/>
                     <a:stretch>
                       <a:fillRect/>
                     </a:stretch>
@@ -1036,7 +1012,7 @@
                   <pic:spPr bwMode="auto">
                     <a:xfrm>
                       <a:off x="0" y="0"/>
-                      <a:ext cx="5334000" cy="2889250"/>
+                      <a:ext cx="4608576" cy="2496312"/>
                     </a:xfrm>
                     <a:prstGeom prst="rect">
                       <a:avLst/>
@@ -1213,20 +1189,20 @@
       <w:r>
         <w:drawing>
           <wp:inline>
-            <wp:extent cx="5334000" cy="2476500"/>
+            <wp:extent cx="4608576" cy="2139696"/>
             <wp:effectExtent b="0" l="0" r="0" t="0"/>
-            <wp:docPr descr="Figure 5 – Disease rate per categorical level (n shown on bars)" title="" id="26" name="Picture"/>
+            <wp:docPr descr="Figure 5 – Disease rate per categorical level (n shown on bars)" title="" id="79" name="Picture"/>
             <a:graphic>
               <a:graphicData uri="http://schemas.openxmlformats.org/drawingml/2006/picture">
                 <pic:pic>
                   <pic:nvPicPr>
-                    <pic:cNvPr descr="figures/eda/03_categorical_disease_rate.png" id="27" name="Picture"/>
+                    <pic:cNvPr descr="figures/eda/03_categorical_disease_rate.png" id="80" name="Picture"/>
                     <pic:cNvPicPr>
                       <a:picLocks noChangeArrowheads="1" noChangeAspect="1"/>
                     </pic:cNvPicPr>
                   </pic:nvPicPr>
                   <pic:blipFill>
-                    <a:blip r:embed="rId25"/>
+                    <a:blip r:embed="rId78"/>
                     <a:stretch>
                       <a:fillRect/>
                     </a:stretch>
@@ -1234,7 +1210,7 @@
                   <pic:spPr bwMode="auto">
                     <a:xfrm>
                       <a:off x="0" y="0"/>
-                      <a:ext cx="5334000" cy="2476500"/>
+                      <a:ext cx="4608576" cy="2139696"/>
                     </a:xfrm>
                     <a:prstGeom prst="rect">
                       <a:avLst/>
@@ -1268,20 +1244,20 @@
       <w:r>
         <w:drawing>
           <wp:inline>
-            <wp:extent cx="4000500" cy="3333750"/>
+            <wp:extent cx="2944368" cy="2453640"/>
             <wp:effectExtent b="0" l="0" r="0" t="0"/>
-            <wp:docPr descr="Figure 6 – Spearman correlations" title="" id="29" name="Picture"/>
+            <wp:docPr descr="Figure 6 – Spearman correlations" title="" id="82" name="Picture"/>
             <a:graphic>
               <a:graphicData uri="http://schemas.openxmlformats.org/drawingml/2006/picture">
                 <pic:pic>
                   <pic:nvPicPr>
-                    <pic:cNvPr descr="figures/eda/04_correlation_heatmap.png" id="30" name="Picture"/>
+                    <pic:cNvPr descr="figures/eda/04_correlation_heatmap.png" id="83" name="Picture"/>
                     <pic:cNvPicPr>
                       <a:picLocks noChangeArrowheads="1" noChangeAspect="1"/>
                     </pic:cNvPicPr>
                   </pic:nvPicPr>
                   <pic:blipFill>
-                    <a:blip r:embed="rId28"/>
+                    <a:blip r:embed="rId81"/>
                     <a:stretch>
                       <a:fillRect/>
                     </a:stretch>
@@ -1289,7 +1265,7 @@
                   <pic:spPr bwMode="auto">
                     <a:xfrm>
                       <a:off x="0" y="0"/>
-                      <a:ext cx="4000500" cy="3333750"/>
+                      <a:ext cx="2944368" cy="2453640"/>
                     </a:xfrm>
                     <a:prstGeom prst="rect">
                       <a:avLst/>
@@ -1459,9 +1435,9 @@
         <w:t xml:space="preserve">, each with |ρ| ≈ 0.4–0.5.</w:t>
       </w:r>
     </w:p>
-    <w:bookmarkEnd w:id="31"/>
-    <w:bookmarkEnd w:id="32"/>
-    <w:bookmarkStart w:id="48" w:name="feature-engineering-and-modelling"/>
+    <w:bookmarkEnd w:id="84"/>
+    <w:bookmarkEnd w:id="85"/>
+    <w:bookmarkStart w:id="101" w:name="feature-engineering-and-modelling"/>
     <w:p>
       <w:pPr>
         <w:pStyle w:val="Heading1"/>
@@ -1470,7 +1446,7 @@
         <w:t xml:space="preserve">3. Feature engineering and modelling</w:t>
       </w:r>
     </w:p>
-    <w:bookmarkStart w:id="36" w:name="feature-pipeline"/>
+    <w:bookmarkStart w:id="89" w:name="feature-pipeline"/>
     <w:p>
       <w:pPr>
         <w:pStyle w:val="Heading2"/>
@@ -1679,20 +1655,20 @@
       <w:r>
         <w:drawing>
           <wp:inline>
-            <wp:extent cx="3200400" cy="2461846"/>
+            <wp:extent cx="2880360" cy="2215661"/>
             <wp:effectExtent b="0" l="0" r="0" t="0"/>
-            <wp:docPr descr="Figure 7 – Motivation for the heart-rate-reserve ratio" title="" id="34" name="Picture"/>
+            <wp:docPr descr="Figure 7 – Motivation for the heart-rate-reserve ratio" title="" id="87" name="Picture"/>
             <a:graphic>
               <a:graphicData uri="http://schemas.openxmlformats.org/drawingml/2006/picture">
                 <pic:pic>
                   <pic:nvPicPr>
-                    <pic:cNvPr descr="figures/eda/06_age_vs_thalach.png" id="35" name="Picture"/>
+                    <pic:cNvPr descr="figures/eda/06_age_vs_thalach.png" id="88" name="Picture"/>
                     <pic:cNvPicPr>
                       <a:picLocks noChangeArrowheads="1" noChangeAspect="1"/>
                     </pic:cNvPicPr>
                   </pic:nvPicPr>
                   <pic:blipFill>
-                    <a:blip r:embed="rId33"/>
+                    <a:blip r:embed="rId86"/>
                     <a:stretch>
                       <a:fillRect/>
                     </a:stretch>
@@ -1700,7 +1676,7 @@
                   <pic:spPr bwMode="auto">
                     <a:xfrm>
                       <a:off x="0" y="0"/>
-                      <a:ext cx="3200400" cy="2461846"/>
+                      <a:ext cx="2880360" cy="2215661"/>
                     </a:xfrm>
                     <a:prstGeom prst="rect">
                       <a:avLst/>
@@ -1813,8 +1789,8 @@
         <w:t xml:space="preserve">3/6/7 is not an ordered scale.</w:t>
       </w:r>
     </w:p>
-    <w:bookmarkEnd w:id="36"/>
-    <w:bookmarkStart w:id="37" w:name="candidate-models-and-tuning"/>
+    <w:bookmarkEnd w:id="89"/>
+    <w:bookmarkStart w:id="90" w:name="candidate-models-and-tuning"/>
     <w:p>
       <w:pPr>
         <w:pStyle w:val="Heading2"/>
@@ -2111,8 +2087,8 @@
         <w:t xml:space="preserve">, so the tuning process can be audited.</w:t>
       </w:r>
     </w:p>
-    <w:bookmarkEnd w:id="37"/>
-    <w:bookmarkStart w:id="47" w:name="results"/>
+    <w:bookmarkEnd w:id="90"/>
+    <w:bookmarkStart w:id="100" w:name="results"/>
     <w:p>
       <w:pPr>
         <w:pStyle w:val="Heading2"/>
@@ -2586,20 +2562,20 @@
       <w:r>
         <w:drawing>
           <wp:inline>
-            <wp:extent cx="4533900" cy="2550318"/>
+            <wp:extent cx="3840480" cy="2160270"/>
             <wp:effectExtent b="0" l="0" r="0" t="0"/>
-            <wp:docPr descr="Figure 8 – Cross-validated comparison (mean ± std over 5 folds)" title="" id="39" name="Picture"/>
+            <wp:docPr descr="Figure 8 – Cross-validated comparison (mean ± std over 5 folds)" title="" id="92" name="Picture"/>
             <a:graphic>
               <a:graphicData uri="http://schemas.openxmlformats.org/drawingml/2006/picture">
                 <pic:pic>
                   <pic:nvPicPr>
-                    <pic:cNvPr descr="figures/training/model_comparison.png" id="40" name="Picture"/>
+                    <pic:cNvPr descr="figures/training/model_comparison.png" id="93" name="Picture"/>
                     <pic:cNvPicPr>
                       <a:picLocks noChangeArrowheads="1" noChangeAspect="1"/>
                     </pic:cNvPicPr>
                   </pic:nvPicPr>
                   <pic:blipFill>
-                    <a:blip r:embed="rId38"/>
+                    <a:blip r:embed="rId91"/>
                     <a:stretch>
                       <a:fillRect/>
                     </a:stretch>
@@ -2607,7 +2583,7 @@
                   <pic:spPr bwMode="auto">
                     <a:xfrm>
                       <a:off x="0" y="0"/>
-                      <a:ext cx="4533900" cy="2550318"/>
+                      <a:ext cx="3840480" cy="2160270"/>
                     </a:xfrm>
                     <a:prstGeom prst="rect">
                       <a:avLst/>
@@ -2714,20 +2690,20 @@
       <w:r>
         <w:drawing>
           <wp:inline>
-            <wp:extent cx="2400300" cy="2160270"/>
+            <wp:extent cx="2048256" cy="1843430"/>
             <wp:effectExtent b="0" l="0" r="0" t="0"/>
-            <wp:docPr descr="Figure 9 – Hold-out ROC and confusion matrix (LR)" title="" id="42" name="Picture"/>
+            <wp:docPr descr="Figure 9 – Hold-out ROC and confusion matrix (LR)" title="" id="95" name="Picture"/>
             <a:graphic>
               <a:graphicData uri="http://schemas.openxmlformats.org/drawingml/2006/picture">
                 <pic:pic>
                   <pic:nvPicPr>
-                    <pic:cNvPr descr="figures/training/roc_logistic_regression.png" id="43" name="Picture"/>
+                    <pic:cNvPr descr="figures/training/roc_logistic_regression.png" id="96" name="Picture"/>
                     <pic:cNvPicPr>
                       <a:picLocks noChangeArrowheads="1" noChangeAspect="1"/>
                     </pic:cNvPicPr>
                   </pic:nvPicPr>
                   <pic:blipFill>
-                    <a:blip r:embed="rId41"/>
+                    <a:blip r:embed="rId94"/>
                     <a:stretch>
                       <a:fillRect/>
                     </a:stretch>
@@ -2735,7 +2711,7 @@
                   <pic:spPr bwMode="auto">
                     <a:xfrm>
                       <a:off x="0" y="0"/>
-                      <a:ext cx="2400300" cy="2160270"/>
+                      <a:ext cx="2048256" cy="1843430"/>
                     </a:xfrm>
                     <a:prstGeom prst="rect">
                       <a:avLst/>
@@ -2759,20 +2735,20 @@
       <w:r>
         <w:drawing>
           <wp:inline>
-            <wp:extent cx="2240280" cy="1991360"/>
+            <wp:extent cx="1920240" cy="1706880"/>
             <wp:effectExtent b="0" l="0" r="0" t="0"/>
-            <wp:docPr descr="" title="" id="45" name="Picture"/>
+            <wp:docPr descr="" title="" id="98" name="Picture"/>
             <a:graphic>
               <a:graphicData uri="http://schemas.openxmlformats.org/drawingml/2006/picture">
                 <pic:pic>
                   <pic:nvPicPr>
-                    <pic:cNvPr descr="figures/training/confusion_logistic_regression.png" id="46" name="Picture"/>
+                    <pic:cNvPr descr="figures/training/confusion_logistic_regression.png" id="99" name="Picture"/>
                     <pic:cNvPicPr>
                       <a:picLocks noChangeArrowheads="1" noChangeAspect="1"/>
                     </pic:cNvPicPr>
                   </pic:nvPicPr>
                   <pic:blipFill>
-                    <a:blip r:embed="rId44"/>
+                    <a:blip r:embed="rId97"/>
                     <a:stretch>
                       <a:fillRect/>
                     </a:stretch>
@@ -2780,7 +2756,7 @@
                   <pic:spPr bwMode="auto">
                     <a:xfrm>
                       <a:off x="0" y="0"/>
-                      <a:ext cx="2240280" cy="1991360"/>
+                      <a:ext cx="1920240" cy="1706880"/>
                     </a:xfrm>
                     <a:prstGeom prst="rect">
                       <a:avLst/>
@@ -2936,9 +2912,9 @@
         <w:t xml:space="preserve">and saved as the shipped artefact.</w:t>
       </w:r>
     </w:p>
-    <w:bookmarkEnd w:id="47"/>
-    <w:bookmarkEnd w:id="48"/>
-    <w:bookmarkStart w:id="55" w:name="experiment-tracking-mlflow"/>
+    <w:bookmarkEnd w:id="100"/>
+    <w:bookmarkEnd w:id="101"/>
+    <w:bookmarkStart w:id="108" w:name="experiment-tracking-mlflow"/>
     <w:p>
       <w:pPr>
         <w:pStyle w:val="Heading1"/>
@@ -3401,25 +3377,25 @@
     </w:p>
     <w:p>
       <w:pPr>
-        <w:pStyle w:val="CaptionedFigure"/>
+        <w:pStyle w:val="BodyText"/>
       </w:pPr>
       <w:r>
         <w:drawing>
           <wp:inline>
-            <wp:extent cx="5334000" cy="3333750"/>
+            <wp:extent cx="3136392" cy="1960244"/>
             <wp:effectExtent b="0" l="0" r="0" t="0"/>
-            <wp:docPr descr="Figure 10 – MLflow experiment: candidate and final runs (two training invocations)" title="" id="50" name="Picture"/>
+            <wp:docPr descr="" title="" id="103" name="Picture"/>
             <a:graphic>
               <a:graphicData uri="http://schemas.openxmlformats.org/drawingml/2006/picture">
                 <pic:pic>
                   <pic:nvPicPr>
-                    <pic:cNvPr descr="../screenshots/mlflow_experiment_runs.png" id="51" name="Picture"/>
+                    <pic:cNvPr descr="../screenshots/mlflow_experiment_runs.png" id="104" name="Picture"/>
                     <pic:cNvPicPr>
                       <a:picLocks noChangeArrowheads="1" noChangeAspect="1"/>
                     </pic:cNvPicPr>
                   </pic:nvPicPr>
                   <pic:blipFill>
-                    <a:blip r:embed="rId49"/>
+                    <a:blip r:embed="rId102"/>
                     <a:stretch>
                       <a:fillRect/>
                     </a:stretch>
@@ -3427,7 +3403,7 @@
                   <pic:spPr bwMode="auto">
                     <a:xfrm>
                       <a:off x="0" y="0"/>
-                      <a:ext cx="5334000" cy="3333750"/>
+                      <a:ext cx="3136392" cy="1960244"/>
                     </a:xfrm>
                     <a:prstGeom prst="rect">
                       <a:avLst/>
@@ -3445,36 +3421,26 @@
           </wp:inline>
         </w:drawing>
       </w:r>
-    </w:p>
-    <w:p>
-      <w:pPr>
-        <w:pStyle w:val="ImageCaption"/>
-      </w:pPr>
-      <w:r>
-        <w:t xml:space="preserve">Figure 10 – MLflow experiment: candidate and final runs (two training invocations)</w:t>
-      </w:r>
-    </w:p>
-    <w:p>
-      <w:pPr>
-        <w:pStyle w:val="CaptionedFigure"/>
-      </w:pPr>
+      <w:r>
+        <w:t xml:space="preserve"> </w:t>
+      </w:r>
       <w:r>
         <w:drawing>
           <wp:inline>
-            <wp:extent cx="5334000" cy="3333750"/>
+            <wp:extent cx="3136392" cy="1960244"/>
             <wp:effectExtent b="0" l="0" r="0" t="0"/>
-            <wp:docPr descr="Figure 11 – Logged artefacts and model signature of the selected run" title="" id="53" name="Picture"/>
+            <wp:docPr descr="" title="" id="106" name="Picture"/>
             <a:graphic>
               <a:graphicData uri="http://schemas.openxmlformats.org/drawingml/2006/picture">
                 <pic:pic>
                   <pic:nvPicPr>
-                    <pic:cNvPr descr="../screenshots/mlflow_run_artifacts.png" id="54" name="Picture"/>
+                    <pic:cNvPr descr="../screenshots/mlflow_run_artifacts.png" id="107" name="Picture"/>
                     <pic:cNvPicPr>
                       <a:picLocks noChangeArrowheads="1" noChangeAspect="1"/>
                     </pic:cNvPicPr>
                   </pic:nvPicPr>
                   <pic:blipFill>
-                    <a:blip r:embed="rId52"/>
+                    <a:blip r:embed="rId105"/>
                     <a:stretch>
                       <a:fillRect/>
                     </a:stretch>
@@ -3482,7 +3448,7 @@
                   <pic:spPr bwMode="auto">
                     <a:xfrm>
                       <a:off x="0" y="0"/>
-                      <a:ext cx="5334000" cy="3333750"/>
+                      <a:ext cx="3136392" cy="1960244"/>
                     </a:xfrm>
                     <a:prstGeom prst="rect">
                       <a:avLst/>
@@ -3503,14 +3469,18 @@
     </w:p>
     <w:p>
       <w:pPr>
-        <w:pStyle w:val="ImageCaption"/>
-      </w:pPr>
-      <w:r>
-        <w:t xml:space="preserve">Figure 11 – Logged artefacts and model signature of the selected run</w:t>
-      </w:r>
-    </w:p>
-    <w:bookmarkEnd w:id="55"/>
-    <w:bookmarkStart w:id="56" w:name="packaging-and-reproducibility"/>
+        <w:pStyle w:val="BodyText"/>
+      </w:pPr>
+      <w:r>
+        <w:rPr>
+          <w:i/>
+          <w:iCs/>
+        </w:rPr>
+        <w:t xml:space="preserve">Figure 10 (left) – MLflow experiment: candidate and final runs (two training invocations). Figure 11 (right) – Logged artefacts and model signature of the selected run.</w:t>
+      </w:r>
+    </w:p>
+    <w:bookmarkEnd w:id="108"/>
+    <w:bookmarkStart w:id="109" w:name="packaging-and-reproducibility"/>
     <w:p>
       <w:pPr>
         <w:pStyle w:val="Heading1"/>
@@ -3831,8 +3801,8 @@
         <w:t xml:space="preserve">job runs on a clean Ubuntu runner.</w:t>
       </w:r>
     </w:p>
-    <w:bookmarkEnd w:id="56"/>
-    <w:bookmarkStart w:id="59" w:name="cicd-and-automated-testing"/>
+    <w:bookmarkEnd w:id="109"/>
+    <w:bookmarkStart w:id="118" w:name="cicd-and-automated-testing"/>
     <w:p>
       <w:pPr>
         <w:pStyle w:val="Heading1"/>
@@ -3841,7 +3811,7 @@
         <w:t xml:space="preserve">6. CI/CD and automated testing</w:t>
       </w:r>
     </w:p>
-    <w:bookmarkStart w:id="57" w:name="tests-tests-36-tests-about-1-s"/>
+    <w:bookmarkStart w:id="110" w:name="tests-tests-36-tests-about-1-s"/>
     <w:p>
       <w:pPr>
         <w:pStyle w:val="Heading2"/>
@@ -4135,8 +4105,8 @@
         <w:t xml:space="preserve">job instead.</w:t>
       </w:r>
     </w:p>
-    <w:bookmarkEnd w:id="57"/>
-    <w:bookmarkStart w:id="58" w:name="workflow-.githubworkflowsci.yml"/>
+    <w:bookmarkEnd w:id="110"/>
+    <w:bookmarkStart w:id="117" w:name="workflow-.githubworkflowsci.yml"/>
     <w:p>
       <w:pPr>
         <w:pStyle w:val="Heading2"/>
@@ -4704,60 +4674,108 @@
         <w:pStyle w:val="BodyText"/>
       </w:pPr>
       <w:r>
+        <w:drawing>
+          <wp:inline>
+            <wp:extent cx="3136392" cy="1663396"/>
+            <wp:effectExtent b="0" l="0" r="0" t="0"/>
+            <wp:docPr descr="" title="" id="112" name="Picture"/>
+            <a:graphic>
+              <a:graphicData uri="http://schemas.openxmlformats.org/drawingml/2006/picture">
+                <pic:pic>
+                  <pic:nvPicPr>
+                    <pic:cNvPr descr="../screenshots/github_actions_run.png" id="113" name="Picture"/>
+                    <pic:cNvPicPr>
+                      <a:picLocks noChangeArrowheads="1" noChangeAspect="1"/>
+                    </pic:cNvPicPr>
+                  </pic:nvPicPr>
+                  <pic:blipFill>
+                    <a:blip r:embed="rId111"/>
+                    <a:stretch>
+                      <a:fillRect/>
+                    </a:stretch>
+                  </pic:blipFill>
+                  <pic:spPr bwMode="auto">
+                    <a:xfrm>
+                      <a:off x="0" y="0"/>
+                      <a:ext cx="3136392" cy="1663396"/>
+                    </a:xfrm>
+                    <a:prstGeom prst="rect">
+                      <a:avLst/>
+                    </a:prstGeom>
+                    <a:noFill/>
+                    <a:ln w="9525">
+                      <a:noFill/>
+                      <a:headEnd/>
+                      <a:tailEnd/>
+                    </a:ln>
+                  </pic:spPr>
+                </pic:pic>
+              </a:graphicData>
+            </a:graphic>
+          </wp:inline>
+        </w:drawing>
+      </w:r>
+      <w:r>
+        <w:t xml:space="preserve"> </w:t>
+      </w:r>
+      <w:r>
+        <w:drawing>
+          <wp:inline>
+            <wp:extent cx="3136392" cy="1031487"/>
+            <wp:effectExtent b="0" l="0" r="0" t="0"/>
+            <wp:docPr descr="" title="" id="115" name="Picture"/>
+            <a:graphic>
+              <a:graphicData uri="http://schemas.openxmlformats.org/drawingml/2006/picture">
+                <pic:pic>
+                  <pic:nvPicPr>
+                    <pic:cNvPr descr="../screenshots/github_actions_artifacts.png" id="116" name="Picture"/>
+                    <pic:cNvPicPr>
+                      <a:picLocks noChangeArrowheads="1" noChangeAspect="1"/>
+                    </pic:cNvPicPr>
+                  </pic:nvPicPr>
+                  <pic:blipFill>
+                    <a:blip r:embed="rId114"/>
+                    <a:stretch>
+                      <a:fillRect/>
+                    </a:stretch>
+                  </pic:blipFill>
+                  <pic:spPr bwMode="auto">
+                    <a:xfrm>
+                      <a:off x="0" y="0"/>
+                      <a:ext cx="3136392" cy="1031487"/>
+                    </a:xfrm>
+                    <a:prstGeom prst="rect">
+                      <a:avLst/>
+                    </a:prstGeom>
+                    <a:noFill/>
+                    <a:ln w="9525">
+                      <a:noFill/>
+                      <a:headEnd/>
+                      <a:tailEnd/>
+                    </a:ln>
+                  </pic:spPr>
+                </pic:pic>
+              </a:graphicData>
+            </a:graphic>
+          </wp:inline>
+        </w:drawing>
+      </w:r>
+    </w:p>
+    <w:p>
+      <w:pPr>
+        <w:pStyle w:val="BodyText"/>
+      </w:pPr>
+      <w:r>
         <w:rPr>
           <w:i/>
           <w:iCs/>
         </w:rPr>
-        <w:t xml:space="preserve">Figures 12–13: GitHub Actions run and artefacts. Screenshots go here:</w:t>
-      </w:r>
-      <w:r>
-        <w:rPr>
-          <w:i/>
-          <w:iCs/>
-        </w:rPr>
-        <w:t xml:space="preserve"> </w:t>
-      </w:r>
-      <w:r>
-        <w:rPr>
-          <w:rStyle w:val="VerbatimChar"/>
-          <w:i/>
-          <w:iCs/>
-        </w:rPr>
-        <w:t xml:space="preserve">screenshots/github_actions_run.png</w:t>
-      </w:r>
-      <w:r>
-        <w:rPr>
-          <w:i/>
-          <w:iCs/>
-        </w:rPr>
-        <w:t xml:space="preserve">,</w:t>
-      </w:r>
-      <w:r>
-        <w:rPr>
-          <w:i/>
-          <w:iCs/>
-        </w:rPr>
-        <w:t xml:space="preserve"> </w:t>
-      </w:r>
-      <w:r>
-        <w:rPr>
-          <w:rStyle w:val="VerbatimChar"/>
-          <w:i/>
-          <w:iCs/>
-        </w:rPr>
-        <w:t xml:space="preserve">screenshots/github_actions_artifacts.png</w:t>
-      </w:r>
-      <w:r>
-        <w:rPr>
-          <w:i/>
-          <w:iCs/>
-        </w:rPr>
-        <w:t xml:space="preserve">.</w:t>
-      </w:r>
-    </w:p>
-    <w:bookmarkEnd w:id="58"/>
-    <w:bookmarkEnd w:id="59"/>
-    <w:bookmarkStart w:id="62" w:name="containerisation-and-deployment"/>
+        <w:t xml:space="preserve">Figure 12 (left) – Green GitHub Actions run (lint → test → train → docker, plus k8s-manifests) with the training job summary. Figure 13 (right) – Artefacts produced by the run: Docker image, MLflow runs, model, test and training reports.</w:t>
+      </w:r>
+    </w:p>
+    <w:bookmarkEnd w:id="117"/>
+    <w:bookmarkEnd w:id="118"/>
+    <w:bookmarkStart w:id="136" w:name="containerisation-and-deployment"/>
     <w:p>
       <w:pPr>
         <w:pStyle w:val="Heading1"/>
@@ -4766,7 +4784,7 @@
         <w:t xml:space="preserve">7. Containerisation and deployment</w:t>
       </w:r>
     </w:p>
-    <w:bookmarkStart w:id="60" w:name="container"/>
+    <w:bookmarkStart w:id="122" w:name="container"/>
     <w:p>
       <w:pPr>
         <w:pStyle w:val="Heading2"/>
@@ -5430,120 +5448,103 @@
     </w:p>
     <w:p>
       <w:pPr>
-        <w:pStyle w:val="BodyText"/>
-      </w:pPr>
-      <w:r>
-        <w:rPr>
-          <w:i/>
-          <w:iCs/>
-        </w:rPr>
-        <w:t xml:space="preserve">Figure 14:</w:t>
-      </w:r>
-      <w:r>
-        <w:rPr>
-          <w:i/>
-          <w:iCs/>
-        </w:rPr>
-        <w:t xml:space="preserve"> </w:t>
-      </w:r>
-      <w:r>
-        <w:rPr>
-          <w:rStyle w:val="VerbatimChar"/>
-          <w:i/>
-          <w:iCs/>
-        </w:rPr>
-        <w:t xml:space="preserve">docker build</w:t>
-      </w:r>
-      <w:r>
-        <w:rPr>
-          <w:i/>
-          <w:iCs/>
-        </w:rPr>
-        <w:t xml:space="preserve"> </w:t>
-      </w:r>
-      <w:r>
-        <w:rPr>
-          <w:i/>
-          <w:iCs/>
-        </w:rPr>
-        <w:t xml:space="preserve">/</w:t>
-      </w:r>
-      <w:r>
-        <w:rPr>
-          <w:i/>
-          <w:iCs/>
-        </w:rPr>
-        <w:t xml:space="preserve"> </w:t>
-      </w:r>
-      <w:r>
-        <w:rPr>
-          <w:rStyle w:val="VerbatimChar"/>
-          <w:i/>
-          <w:iCs/>
+        <w:pStyle w:val="CaptionedFigure"/>
+      </w:pPr>
+      <w:r>
+        <w:drawing>
+          <wp:inline>
+            <wp:extent cx="4992624" cy="1719593"/>
+            <wp:effectExtent b="0" l="0" r="0" t="0"/>
+            <wp:docPr descr="Figure 14 – make docker-build, docker run and curl /predict on the lab server: high-risk sample → 1 (p = 0.997)" title="" id="120" name="Picture"/>
+            <a:graphic>
+              <a:graphicData uri="http://schemas.openxmlformats.org/drawingml/2006/picture">
+                <pic:pic>
+                  <pic:nvPicPr>
+                    <pic:cNvPr descr="../screenshots/docker_build_run.png" id="121" name="Picture"/>
+                    <pic:cNvPicPr>
+                      <a:picLocks noChangeArrowheads="1" noChangeAspect="1"/>
+                    </pic:cNvPicPr>
+                  </pic:nvPicPr>
+                  <pic:blipFill>
+                    <a:blip r:embed="rId119"/>
+                    <a:stretch>
+                      <a:fillRect/>
+                    </a:stretch>
+                  </pic:blipFill>
+                  <pic:spPr bwMode="auto">
+                    <a:xfrm>
+                      <a:off x="0" y="0"/>
+                      <a:ext cx="4992624" cy="1719593"/>
+                    </a:xfrm>
+                    <a:prstGeom prst="rect">
+                      <a:avLst/>
+                    </a:prstGeom>
+                    <a:noFill/>
+                    <a:ln w="9525">
+                      <a:noFill/>
+                      <a:headEnd/>
+                      <a:tailEnd/>
+                    </a:ln>
+                  </pic:spPr>
+                </pic:pic>
+              </a:graphicData>
+            </a:graphic>
+          </wp:inline>
+        </w:drawing>
+      </w:r>
+    </w:p>
+    <w:p>
+      <w:pPr>
+        <w:pStyle w:val="ImageCaption"/>
+      </w:pPr>
+      <w:r>
+        <w:t xml:space="preserve">Figure 14 –</w:t>
+      </w:r>
+      <w:r>
+        <w:t xml:space="preserve"> </w:t>
+      </w:r>
+      <w:r>
+        <w:rPr>
+          <w:rStyle w:val="VerbatimChar"/>
+        </w:rPr>
+        <w:t xml:space="preserve">make docker-build</w:t>
+      </w:r>
+      <w:r>
+        <w:t xml:space="preserve">,</w:t>
+      </w:r>
+      <w:r>
+        <w:t xml:space="preserve"> </w:t>
+      </w:r>
+      <w:r>
+        <w:rPr>
+          <w:rStyle w:val="VerbatimChar"/>
         </w:rPr>
         <w:t xml:space="preserve">docker run</w:t>
       </w:r>
       <w:r>
-        <w:rPr>
-          <w:i/>
-          <w:iCs/>
-        </w:rPr>
-        <w:t xml:space="preserve"> </w:t>
-      </w:r>
-      <w:r>
-        <w:rPr>
-          <w:i/>
-          <w:iCs/>
-        </w:rPr>
-        <w:t xml:space="preserve">/</w:t>
-      </w:r>
-      <w:r>
-        <w:rPr>
-          <w:i/>
-          <w:iCs/>
-        </w:rPr>
-        <w:t xml:space="preserve"> </w:t>
-      </w:r>
-      <w:r>
-        <w:rPr>
-          <w:rStyle w:val="VerbatimChar"/>
-          <w:i/>
-          <w:iCs/>
+        <w:t xml:space="preserve"> </w:t>
+      </w:r>
+      <w:r>
+        <w:t xml:space="preserve">and</w:t>
+      </w:r>
+      <w:r>
+        <w:t xml:space="preserve"> </w:t>
+      </w:r>
+      <w:r>
+        <w:rPr>
+          <w:rStyle w:val="VerbatimChar"/>
         </w:rPr>
         <w:t xml:space="preserve">curl /predict</w:t>
       </w:r>
       <w:r>
-        <w:rPr>
-          <w:i/>
-          <w:iCs/>
-        </w:rPr>
-        <w:t xml:space="preserve">. Screenshot goes here:</w:t>
-      </w:r>
-      <w:r>
-        <w:rPr>
-          <w:i/>
-          <w:iCs/>
-        </w:rPr>
-        <w:t xml:space="preserve"> </w:t>
-      </w:r>
-      <w:r>
-        <w:rPr>
-          <w:rStyle w:val="VerbatimChar"/>
-          <w:i/>
-          <w:iCs/>
-        </w:rPr>
-        <w:t xml:space="preserve">screenshots/docker_build_run.png</w:t>
-      </w:r>
-      <w:r>
-        <w:rPr>
-          <w:i/>
-          <w:iCs/>
-        </w:rPr>
-        <w:t xml:space="preserve">.</w:t>
-      </w:r>
-    </w:p>
-    <w:bookmarkEnd w:id="60"/>
-    <w:bookmarkStart w:id="61" w:name="kubernetes"/>
+        <w:t xml:space="preserve"> </w:t>
+      </w:r>
+      <w:r>
+        <w:t xml:space="preserve">on the lab server: high-risk sample → 1 (p = 0.997)</w:t>
+      </w:r>
+    </w:p>
+    <w:bookmarkEnd w:id="122"/>
+    <w:bookmarkStart w:id="135" w:name="kubernetes"/>
     <w:p>
       <w:pPr>
         <w:pStyle w:val="Heading2"/>
@@ -5557,19 +5558,49 @@
         <w:pStyle w:val="FirstParagraph"/>
       </w:pPr>
       <w:r>
-        <w:t xml:space="preserve">The target is a local k3s cluster created with</w:t>
-      </w:r>
-      <w:r>
-        <w:t xml:space="preserve"> </w:t>
-      </w:r>
-      <w:r>
-        <w:rPr>
-          <w:rStyle w:val="VerbatimChar"/>
-        </w:rPr>
-        <w:t xml:space="preserve">colima start --kubernetes</w:t>
-      </w:r>
-      <w:r>
-        <w:t xml:space="preserve">. The manifests are plain YAML assembled with Kustomize (</w:t>
+        <w:t xml:space="preserve">The target is a local minikube cluster (Kubernetes v1.37, Docker driver) started with</w:t>
+      </w:r>
+      <w:r>
+        <w:t xml:space="preserve"> </w:t>
+      </w:r>
+      <w:r>
+        <w:rPr>
+          <w:rStyle w:val="VerbatimChar"/>
+        </w:rPr>
+        <w:t xml:space="preserve">minikube start --driver=docker --addons=ingress,metrics-server</w:t>
+      </w:r>
+      <w:r>
+        <w:t xml:space="preserve">. The</w:t>
+      </w:r>
+      <w:r>
+        <w:t xml:space="preserve"> </w:t>
+      </w:r>
+      <w:r>
+        <w:rPr>
+          <w:rStyle w:val="VerbatimChar"/>
+        </w:rPr>
+        <w:t xml:space="preserve">ingress</w:t>
+      </w:r>
+      <w:r>
+        <w:t xml:space="preserve"> </w:t>
+      </w:r>
+      <w:r>
+        <w:t xml:space="preserve">addon provides the NGINX ingress controller and</w:t>
+      </w:r>
+      <w:r>
+        <w:t xml:space="preserve"> </w:t>
+      </w:r>
+      <w:r>
+        <w:rPr>
+          <w:rStyle w:val="VerbatimChar"/>
+        </w:rPr>
+        <w:t xml:space="preserve">metrics-server</w:t>
+      </w:r>
+      <w:r>
+        <w:t xml:space="preserve"> </w:t>
+      </w:r>
+      <w:r>
+        <w:t xml:space="preserve">feeds CPU usage to the autoscaler. The manifests are plain YAML assembled with Kustomize (</w:t>
       </w:r>
       <w:r>
         <w:rPr>
@@ -5836,7 +5867,34 @@
               <w:t xml:space="preserve"> </w:t>
             </w:r>
             <w:r>
-              <w:t xml:space="preserve">on port 8080. k3s ServiceLB binds it to the host; on a cloud cluster it provisions a cloud LB.</w:t>
+              <w:t xml:space="preserve">on port 8080.</w:t>
+            </w:r>
+            <w:r>
+              <w:t xml:space="preserve"> </w:t>
+            </w:r>
+            <w:r>
+              <w:rPr>
+                <w:rStyle w:val="VerbatimChar"/>
+              </w:rPr>
+              <w:t xml:space="preserve">minikube tunnel</w:t>
+            </w:r>
+            <w:r>
+              <w:t xml:space="preserve"> </w:t>
+            </w:r>
+            <w:r>
+              <w:t xml:space="preserve">gives it an external IP (</w:t>
+            </w:r>
+            <w:r>
+              <w:rPr>
+                <w:rStyle w:val="VerbatimChar"/>
+              </w:rPr>
+              <w:t xml:space="preserve">127.0.0.1</w:t>
+            </w:r>
+            <w:r>
+              <w:t xml:space="preserve"> </w:t>
+            </w:r>
+            <w:r>
+              <w:t xml:space="preserve">on Windows, the service’s cluster IP on Linux); on a cloud cluster it provisions a cloud LB.</w:t>
             </w:r>
           </w:p>
         </w:tc>
@@ -5878,7 +5936,22 @@
               <w:t xml:space="preserve"> </w:t>
             </w:r>
             <w:r>
-              <w:t xml:space="preserve">through the cluster’s ingress controller (Traefik on k3s)</w:t>
+              <w:t xml:space="preserve">through the NGINX ingress controller (minikube</w:t>
+            </w:r>
+            <w:r>
+              <w:t xml:space="preserve"> </w:t>
+            </w:r>
+            <w:r>
+              <w:rPr>
+                <w:rStyle w:val="VerbatimChar"/>
+              </w:rPr>
+              <w:t xml:space="preserve">ingress</w:t>
+            </w:r>
+            <w:r>
+              <w:t xml:space="preserve"> </w:t>
+            </w:r>
+            <w:r>
+              <w:t xml:space="preserve">addon)</w:t>
             </w:r>
           </w:p>
         </w:tc>
@@ -5905,7 +5978,7 @@
               <w:pStyle w:val="Compact"/>
             </w:pPr>
             <w:r>
-              <w:t xml:space="preserve">2–5 replicas at 70 % CPU</w:t>
+              <w:t xml:space="preserve">2–5 replicas at 70 % CPU of the 100m request. Verified under load: CPU reached 113 % and the HPA scaled the API from 2 to 4 replicas (Figure 18).</w:t>
             </w:r>
           </w:p>
         </w:tc>
@@ -5961,7 +6034,49 @@
         <w:t xml:space="preserve">make k8s-deploy</w:t>
       </w:r>
       <w:r>
-        <w:t xml:space="preserve">) builds the image, loads it into the cluster where needed (minikube or kind), applies everything, waits for the three rollouts and prints the endpoints.</w:t>
+        <w:t xml:space="preserve">) builds the image, loads it into the cluster where needed (</w:t>
+      </w:r>
+      <w:r>
+        <w:rPr>
+          <w:rStyle w:val="VerbatimChar"/>
+        </w:rPr>
+        <w:t xml:space="preserve">minikube image load</w:t>
+      </w:r>
+      <w:r>
+        <w:t xml:space="preserve"> </w:t>
+      </w:r>
+      <w:r>
+        <w:t xml:space="preserve">here), applies everything, waits for the three rollouts and prints the endpoints. Keep</w:t>
+      </w:r>
+      <w:r>
+        <w:t xml:space="preserve"> </w:t>
+      </w:r>
+      <w:r>
+        <w:rPr>
+          <w:rStyle w:val="VerbatimChar"/>
+        </w:rPr>
+        <w:t xml:space="preserve">minikube tunnel</w:t>
+      </w:r>
+      <w:r>
+        <w:t xml:space="preserve"> </w:t>
+      </w:r>
+      <w:r>
+        <w:t xml:space="preserve">running in a separate terminal so the LoadBalancer services are reachable. On a Linux host,</w:t>
+      </w:r>
+      <w:r>
+        <w:t xml:space="preserve"> </w:t>
+      </w:r>
+      <w:r>
+        <w:rPr>
+          <w:rStyle w:val="VerbatimChar"/>
+        </w:rPr>
+        <w:t xml:space="preserve">scripts/run_linux.sh</w:t>
+      </w:r>
+      <w:r>
+        <w:t xml:space="preserve"> </w:t>
+      </w:r>
+      <w:r>
+        <w:t xml:space="preserve">runs every step interactively (tool install, venv, pipeline, Docker check, minikube deploy, port-forwarded access, smoke and load tests).</w:t>
       </w:r>
     </w:p>
     <w:p>
@@ -5975,6 +6090,22 @@
         </w:rPr>
         <w:t xml:space="preserve">Access instructions (local):</w:t>
       </w:r>
+    </w:p>
+    <w:p>
+      <w:pPr>
+        <w:pStyle w:val="Compact"/>
+        <w:numPr>
+          <w:ilvl w:val="0"/>
+          <w:numId w:val="1006"/>
+        </w:numPr>
+      </w:pPr>
+      <w:r>
+        <w:rPr>
+          <w:b/>
+          <w:bCs/>
+        </w:rPr>
+        <w:t xml:space="preserve">Windows / macOS:</w:t>
+      </w:r>
       <w:r>
         <w:t xml:space="preserve"> </w:t>
       </w:r>
@@ -5991,10 +6122,195 @@
         <w:t xml:space="preserve">http://localhost:8080/docs</w:t>
       </w:r>
       <w:r>
-        <w:t xml:space="preserve"> </w:t>
-      </w:r>
-      <w:r>
-        <w:t xml:space="preserve">(LoadBalancer) or</w:t>
+        <w:t xml:space="preserve">, Prometheus at</w:t>
+      </w:r>
+      <w:r>
+        <w:t xml:space="preserve"> </w:t>
+      </w:r>
+      <w:r>
+        <w:rPr>
+          <w:rStyle w:val="VerbatimChar"/>
+        </w:rPr>
+        <w:t xml:space="preserve">:9090</w:t>
+      </w:r>
+      <w:r>
+        <w:t xml:space="preserve">, Grafana at</w:t>
+      </w:r>
+      <w:r>
+        <w:t xml:space="preserve"> </w:t>
+      </w:r>
+      <w:r>
+        <w:rPr>
+          <w:rStyle w:val="VerbatimChar"/>
+        </w:rPr>
+        <w:t xml:space="preserve">:3000</w:t>
+      </w:r>
+      <w:r>
+        <w:t xml:space="preserve"> </w:t>
+      </w:r>
+      <w:r>
+        <w:t xml:space="preserve">while</w:t>
+      </w:r>
+      <w:r>
+        <w:t xml:space="preserve"> </w:t>
+      </w:r>
+      <w:r>
+        <w:rPr>
+          <w:rStyle w:val="VerbatimChar"/>
+        </w:rPr>
+        <w:t xml:space="preserve">minikube tunnel</w:t>
+      </w:r>
+      <w:r>
+        <w:t xml:space="preserve"> </w:t>
+      </w:r>
+      <w:r>
+        <w:t xml:space="preserve">runs.</w:t>
+      </w:r>
+    </w:p>
+    <w:p>
+      <w:pPr>
+        <w:pStyle w:val="Compact"/>
+        <w:numPr>
+          <w:ilvl w:val="0"/>
+          <w:numId w:val="1006"/>
+        </w:numPr>
+      </w:pPr>
+      <w:r>
+        <w:rPr>
+          <w:b/>
+          <w:bCs/>
+        </w:rPr>
+        <w:t xml:space="preserve">Linux:</w:t>
+      </w:r>
+      <w:r>
+        <w:t xml:space="preserve"> </w:t>
+      </w:r>
+      <w:r>
+        <w:t xml:space="preserve">the tunnel serves each LoadBalancer on its external IP, so use</w:t>
+      </w:r>
+      <w:r>
+        <w:t xml:space="preserve"> </w:t>
+      </w:r>
+      <w:r>
+        <w:rPr>
+          <w:rStyle w:val="VerbatimChar"/>
+        </w:rPr>
+        <w:t xml:space="preserve">kubectl -n heart-risk get svc</w:t>
+      </w:r>
+      <w:r>
+        <w:t xml:space="preserve"> </w:t>
+      </w:r>
+      <w:r>
+        <w:t xml:space="preserve">and browse to</w:t>
+      </w:r>
+      <w:r>
+        <w:t xml:space="preserve"> </w:t>
+      </w:r>
+      <w:r>
+        <w:rPr>
+          <w:rStyle w:val="VerbatimChar"/>
+        </w:rPr>
+        <w:t xml:space="preserve">http://&lt;EXTERNAL-IP&gt;:8080/docs</w:t>
+      </w:r>
+      <w:r>
+        <w:t xml:space="preserve"> </w:t>
+      </w:r>
+      <w:r>
+        <w:t xml:space="preserve">(</w:t>
+      </w:r>
+      <w:r>
+        <w:rPr>
+          <w:rStyle w:val="VerbatimChar"/>
+        </w:rPr>
+        <w:t xml:space="preserve">:9090</w:t>
+      </w:r>
+      <w:r>
+        <w:t xml:space="preserve">,</w:t>
+      </w:r>
+      <w:r>
+        <w:t xml:space="preserve"> </w:t>
+      </w:r>
+      <w:r>
+        <w:rPr>
+          <w:rStyle w:val="VerbatimChar"/>
+        </w:rPr>
+        <w:t xml:space="preserve">:3000</w:t>
+      </w:r>
+      <w:r>
+        <w:t xml:space="preserve"> </w:t>
+      </w:r>
+      <w:r>
+        <w:t xml:space="preserve">for the others), or run</w:t>
+      </w:r>
+      <w:r>
+        <w:t xml:space="preserve"> </w:t>
+      </w:r>
+      <w:r>
+        <w:rPr>
+          <w:rStyle w:val="VerbatimChar"/>
+        </w:rPr>
+        <w:t xml:space="preserve">./scripts/run_linux.sh access</w:t>
+      </w:r>
+      <w:r>
+        <w:t xml:space="preserve"> </w:t>
+      </w:r>
+      <w:r>
+        <w:t xml:space="preserve">to port-forward all three to</w:t>
+      </w:r>
+      <w:r>
+        <w:t xml:space="preserve"> </w:t>
+      </w:r>
+      <w:r>
+        <w:rPr>
+          <w:rStyle w:val="VerbatimChar"/>
+        </w:rPr>
+        <w:t xml:space="preserve">localhost</w:t>
+      </w:r>
+      <w:r>
+        <w:t xml:space="preserve">.</w:t>
+      </w:r>
+    </w:p>
+    <w:p>
+      <w:pPr>
+        <w:pStyle w:val="Compact"/>
+        <w:numPr>
+          <w:ilvl w:val="0"/>
+          <w:numId w:val="1006"/>
+        </w:numPr>
+      </w:pPr>
+      <w:r>
+        <w:rPr>
+          <w:b/>
+          <w:bCs/>
+        </w:rPr>
+        <w:t xml:space="preserve">Ingress:</w:t>
+      </w:r>
+      <w:r>
+        <w:t xml:space="preserve"> </w:t>
+      </w:r>
+      <w:r>
+        <w:rPr>
+          <w:rStyle w:val="VerbatimChar"/>
+        </w:rPr>
+        <w:t xml:space="preserve">curl -H "Host: heart-risk.local" http://$(minikube ip)/health</w:t>
+      </w:r>
+      <w:r>
+        <w:t xml:space="preserve">, or add</w:t>
+      </w:r>
+      <w:r>
+        <w:t xml:space="preserve"> </w:t>
+      </w:r>
+      <w:r>
+        <w:rPr>
+          <w:rStyle w:val="VerbatimChar"/>
+        </w:rPr>
+        <w:t xml:space="preserve">heart-risk.local</w:t>
+      </w:r>
+      <w:r>
+        <w:t xml:space="preserve"> </w:t>
+      </w:r>
+      <w:r>
+        <w:t xml:space="preserve">to the hosts file and open</w:t>
       </w:r>
       <w:r>
         <w:t xml:space="preserve"> </w:t>
@@ -6006,34 +6322,99 @@
         <w:t xml:space="preserve">http://heart-risk.local/docs</w:t>
       </w:r>
       <w:r>
-        <w:t xml:space="preserve"> </w:t>
-      </w:r>
-      <w:r>
-        <w:t xml:space="preserve">(Ingress, after adding a hosts entry); Prometheus at</w:t>
-      </w:r>
-      <w:r>
-        <w:t xml:space="preserve"> </w:t>
-      </w:r>
-      <w:r>
-        <w:rPr>
-          <w:rStyle w:val="VerbatimChar"/>
-        </w:rPr>
-        <w:t xml:space="preserve">:9090</w:t>
-      </w:r>
-      <w:r>
-        <w:t xml:space="preserve">; Grafana at</w:t>
-      </w:r>
-      <w:r>
-        <w:t xml:space="preserve"> </w:t>
-      </w:r>
-      <w:r>
-        <w:rPr>
-          <w:rStyle w:val="VerbatimChar"/>
-        </w:rPr>
-        <w:t xml:space="preserve">:3000</w:t>
-      </w:r>
-      <w:r>
         <w:t xml:space="preserve">.</w:t>
+      </w:r>
+    </w:p>
+    <w:p>
+      <w:pPr>
+        <w:pStyle w:val="FirstParagraph"/>
+      </w:pPr>
+      <w:r>
+        <w:drawing>
+          <wp:inline>
+            <wp:extent cx="3136392" cy="1737396"/>
+            <wp:effectExtent b="0" l="0" r="0" t="0"/>
+            <wp:docPr descr="" title="" id="124" name="Picture"/>
+            <a:graphic>
+              <a:graphicData uri="http://schemas.openxmlformats.org/drawingml/2006/picture">
+                <pic:pic>
+                  <pic:nvPicPr>
+                    <pic:cNvPr descr="../screenshots/k8s_pods_services.png" id="125" name="Picture"/>
+                    <pic:cNvPicPr>
+                      <a:picLocks noChangeArrowheads="1" noChangeAspect="1"/>
+                    </pic:cNvPicPr>
+                  </pic:nvPicPr>
+                  <pic:blipFill>
+                    <a:blip r:embed="rId123"/>
+                    <a:stretch>
+                      <a:fillRect/>
+                    </a:stretch>
+                  </pic:blipFill>
+                  <pic:spPr bwMode="auto">
+                    <a:xfrm>
+                      <a:off x="0" y="0"/>
+                      <a:ext cx="3136392" cy="1737396"/>
+                    </a:xfrm>
+                    <a:prstGeom prst="rect">
+                      <a:avLst/>
+                    </a:prstGeom>
+                    <a:noFill/>
+                    <a:ln w="9525">
+                      <a:noFill/>
+                      <a:headEnd/>
+                      <a:tailEnd/>
+                    </a:ln>
+                  </pic:spPr>
+                </pic:pic>
+              </a:graphicData>
+            </a:graphic>
+          </wp:inline>
+        </w:drawing>
+      </w:r>
+      <w:r>
+        <w:t xml:space="preserve"> </w:t>
+      </w:r>
+      <w:r>
+        <w:drawing>
+          <wp:inline>
+            <wp:extent cx="3136392" cy="1351994"/>
+            <wp:effectExtent b="0" l="0" r="0" t="0"/>
+            <wp:docPr descr="" title="" id="127" name="Picture"/>
+            <a:graphic>
+              <a:graphicData uri="http://schemas.openxmlformats.org/drawingml/2006/picture">
+                <pic:pic>
+                  <pic:nvPicPr>
+                    <pic:cNvPr descr="../screenshots/k8s_smoke_load_test.png" id="128" name="Picture"/>
+                    <pic:cNvPicPr>
+                      <a:picLocks noChangeArrowheads="1" noChangeAspect="1"/>
+                    </pic:cNvPicPr>
+                  </pic:nvPicPr>
+                  <pic:blipFill>
+                    <a:blip r:embed="rId126"/>
+                    <a:stretch>
+                      <a:fillRect/>
+                    </a:stretch>
+                  </pic:blipFill>
+                  <pic:spPr bwMode="auto">
+                    <a:xfrm>
+                      <a:off x="0" y="0"/>
+                      <a:ext cx="3136392" cy="1351994"/>
+                    </a:xfrm>
+                    <a:prstGeom prst="rect">
+                      <a:avLst/>
+                    </a:prstGeom>
+                    <a:noFill/>
+                    <a:ln w="9525">
+                      <a:noFill/>
+                      <a:headEnd/>
+                      <a:tailEnd/>
+                    </a:ln>
+                  </pic:spPr>
+                </pic:pic>
+              </a:graphicData>
+            </a:graphic>
+          </wp:inline>
+        </w:drawing>
       </w:r>
     </w:p>
     <w:p>
@@ -6045,7 +6426,7 @@
           <w:i/>
           <w:iCs/>
         </w:rPr>
-        <w:t xml:space="preserve">Figures 15–16:</w:t>
+        <w:t xml:space="preserve">Figure 15 (left) –</w:t>
       </w:r>
       <w:r>
         <w:rPr>
@@ -6060,7 +6441,7 @@
           <w:i/>
           <w:iCs/>
         </w:rPr>
-        <w:t xml:space="preserve">kubectl get pods,svc,ingress,hpa</w:t>
+        <w:t xml:space="preserve">make k8s-deploy</w:t>
       </w:r>
       <w:r>
         <w:rPr>
@@ -6074,7 +6455,7 @@
           <w:i/>
           <w:iCs/>
         </w:rPr>
-        <w:t xml:space="preserve">and the smoke test against</w:t>
+        <w:t xml:space="preserve">on minikube: all resources created, three rollouts complete, 2 API pods plus Prometheus and Grafana running, nginx Ingress for</w:t>
       </w:r>
       <w:r>
         <w:rPr>
@@ -6089,36 +6470,133 @@
           <w:i/>
           <w:iCs/>
         </w:rPr>
-        <w:t xml:space="preserve">localhost:8080</w:t>
+        <w:t xml:space="preserve">heart-risk.local</w:t>
       </w:r>
       <w:r>
         <w:rPr>
           <w:i/>
           <w:iCs/>
         </w:rPr>
-        <w:t xml:space="preserve">. Screenshots go here:</w:t>
-      </w:r>
+        <w:t xml:space="preserve">. Figure 16 (right) – Smoke test against the LoadBalancer (health, model-info, single and batch predictions, 422 on invalid input, metrics), followed by repeated two-minute load tests.</w:t>
+      </w:r>
+    </w:p>
+    <w:p>
+      <w:pPr>
+        <w:pStyle w:val="BodyText"/>
+      </w:pPr>
+      <w:r>
+        <w:drawing>
+          <wp:inline>
+            <wp:extent cx="3328416" cy="1202266"/>
+            <wp:effectExtent b="0" l="0" r="0" t="0"/>
+            <wp:docPr descr="" title="" id="130" name="Picture"/>
+            <a:graphic>
+              <a:graphicData uri="http://schemas.openxmlformats.org/drawingml/2006/picture">
+                <pic:pic>
+                  <pic:nvPicPr>
+                    <pic:cNvPr descr="../screenshots/api_server.png" id="131" name="Picture"/>
+                    <pic:cNvPicPr>
+                      <a:picLocks noChangeArrowheads="1" noChangeAspect="1"/>
+                    </pic:cNvPicPr>
+                  </pic:nvPicPr>
+                  <pic:blipFill>
+                    <a:blip r:embed="rId129"/>
+                    <a:stretch>
+                      <a:fillRect/>
+                    </a:stretch>
+                  </pic:blipFill>
+                  <pic:spPr bwMode="auto">
+                    <a:xfrm>
+                      <a:off x="0" y="0"/>
+                      <a:ext cx="3328416" cy="1202266"/>
+                    </a:xfrm>
+                    <a:prstGeom prst="rect">
+                      <a:avLst/>
+                    </a:prstGeom>
+                    <a:noFill/>
+                    <a:ln w="9525">
+                      <a:noFill/>
+                      <a:headEnd/>
+                      <a:tailEnd/>
+                    </a:ln>
+                  </pic:spPr>
+                </pic:pic>
+              </a:graphicData>
+            </a:graphic>
+          </wp:inline>
+        </w:drawing>
+      </w:r>
+      <w:r>
+        <w:t xml:space="preserve"> </w:t>
+      </w:r>
+      <w:r>
+        <w:drawing>
+          <wp:inline>
+            <wp:extent cx="2944368" cy="434322"/>
+            <wp:effectExtent b="0" l="0" r="0" t="0"/>
+            <wp:docPr descr="" title="" id="133" name="Picture"/>
+            <a:graphic>
+              <a:graphicData uri="http://schemas.openxmlformats.org/drawingml/2006/picture">
+                <pic:pic>
+                  <pic:nvPicPr>
+                    <pic:cNvPr descr="../screenshots/pods_autoscaler.png" id="134" name="Picture"/>
+                    <pic:cNvPicPr>
+                      <a:picLocks noChangeArrowheads="1" noChangeAspect="1"/>
+                    </pic:cNvPicPr>
+                  </pic:nvPicPr>
+                  <pic:blipFill>
+                    <a:blip r:embed="rId132"/>
+                    <a:stretch>
+                      <a:fillRect/>
+                    </a:stretch>
+                  </pic:blipFill>
+                  <pic:spPr bwMode="auto">
+                    <a:xfrm>
+                      <a:off x="0" y="0"/>
+                      <a:ext cx="2944368" cy="434322"/>
+                    </a:xfrm>
+                    <a:prstGeom prst="rect">
+                      <a:avLst/>
+                    </a:prstGeom>
+                    <a:noFill/>
+                    <a:ln w="9525">
+                      <a:noFill/>
+                      <a:headEnd/>
+                      <a:tailEnd/>
+                    </a:ln>
+                  </pic:spPr>
+                </pic:pic>
+              </a:graphicData>
+            </a:graphic>
+          </wp:inline>
+        </w:drawing>
+      </w:r>
+    </w:p>
+    <w:p>
+      <w:pPr>
+        <w:pStyle w:val="BodyText"/>
+      </w:pPr>
       <w:r>
         <w:rPr>
           <w:i/>
           <w:iCs/>
         </w:rPr>
-        <w:t xml:space="preserve"> </w:t>
-      </w:r>
-      <w:r>
-        <w:rPr>
-          <w:rStyle w:val="VerbatimChar"/>
+        <w:t xml:space="preserve">Figure 17 (left) – Swagger UI served by the cluster through the LoadBalancer service. Figure 18 (right) –</w:t>
+      </w:r>
+      <w:r>
+        <w:rPr>
           <w:i/>
           <w:iCs/>
         </w:rPr>
-        <w:t xml:space="preserve">screenshots/k8s_pods_services.png</w:t>
-      </w:r>
-      <w:r>
-        <w:rPr>
+        <w:t xml:space="preserve"> </w:t>
+      </w:r>
+      <w:r>
+        <w:rPr>
+          <w:rStyle w:val="VerbatimChar"/>
           <w:i/>
           <w:iCs/>
         </w:rPr>
-        <w:t xml:space="preserve">,</w:t>
+        <w:t xml:space="preserve">kubectl get hpa -w</w:t>
       </w:r>
       <w:r>
         <w:rPr>
@@ -6129,23 +6607,15 @@
       </w:r>
       <w:r>
         <w:rPr>
-          <w:rStyle w:val="VerbatimChar"/>
           <w:i/>
           <w:iCs/>
         </w:rPr>
-        <w:t xml:space="preserve">screenshots/k8s_smoke_test.png</w:t>
-      </w:r>
-      <w:r>
-        <w:rPr>
-          <w:i/>
-          <w:iCs/>
-        </w:rPr>
-        <w:t xml:space="preserve">.</w:t>
-      </w:r>
-    </w:p>
-    <w:bookmarkEnd w:id="61"/>
-    <w:bookmarkEnd w:id="62"/>
-    <w:bookmarkStart w:id="63" w:name="monitoring-and-logging"/>
+        <w:t xml:space="preserve">during load: CPU rises from 9 % to 113 % of the request and the HPA scales from 2 to 4 replicas, then CPU settles back to 17 %.</w:t>
+      </w:r>
+    </w:p>
+    <w:bookmarkEnd w:id="135"/>
+    <w:bookmarkEnd w:id="136"/>
+    <w:bookmarkStart w:id="143" w:name="monitoring-and-logging"/>
     <w:p>
       <w:pPr>
         <w:pStyle w:val="Heading1"/>
@@ -6661,62 +7131,144 @@
     </w:p>
     <w:p>
       <w:pPr>
-        <w:pStyle w:val="BodyText"/>
-      </w:pPr>
+        <w:pStyle w:val="CaptionedFigure"/>
+      </w:pPr>
+      <w:r>
+        <w:drawing>
+          <wp:inline>
+            <wp:extent cx="4352544" cy="1490597"/>
+            <wp:effectExtent b="0" l="0" r="0" t="0"/>
+            <wp:docPr descr="Figure 19 – Prometheus scraping both API pods separately (heart_api_predictions_total per pod, instance and risk band)" title="" id="138" name="Picture"/>
+            <a:graphic>
+              <a:graphicData uri="http://schemas.openxmlformats.org/drawingml/2006/picture">
+                <pic:pic>
+                  <pic:nvPicPr>
+                    <pic:cNvPr descr="../screenshots/prometheus_targets.png" id="139" name="Picture"/>
+                    <pic:cNvPicPr>
+                      <a:picLocks noChangeArrowheads="1" noChangeAspect="1"/>
+                    </pic:cNvPicPr>
+                  </pic:nvPicPr>
+                  <pic:blipFill>
+                    <a:blip r:embed="rId137"/>
+                    <a:stretch>
+                      <a:fillRect/>
+                    </a:stretch>
+                  </pic:blipFill>
+                  <pic:spPr bwMode="auto">
+                    <a:xfrm>
+                      <a:off x="0" y="0"/>
+                      <a:ext cx="4352544" cy="1490597"/>
+                    </a:xfrm>
+                    <a:prstGeom prst="rect">
+                      <a:avLst/>
+                    </a:prstGeom>
+                    <a:noFill/>
+                    <a:ln w="9525">
+                      <a:noFill/>
+                      <a:headEnd/>
+                      <a:tailEnd/>
+                    </a:ln>
+                  </pic:spPr>
+                </pic:pic>
+              </a:graphicData>
+            </a:graphic>
+          </wp:inline>
+        </w:drawing>
+      </w:r>
+    </w:p>
+    <w:p>
+      <w:pPr>
+        <w:pStyle w:val="ImageCaption"/>
+      </w:pPr>
+      <w:r>
+        <w:t xml:space="preserve">Figure 19 – Prometheus scraping both API pods separately (</w:t>
+      </w:r>
+      <w:r>
+        <w:rPr>
+          <w:rStyle w:val="VerbatimChar"/>
+        </w:rPr>
+        <w:t xml:space="preserve">heart_api_predictions_total</w:t>
+      </w:r>
+      <w:r>
+        <w:t xml:space="preserve"> </w:t>
+      </w:r>
+      <w:r>
+        <w:t xml:space="preserve">per pod, instance and risk band)</w:t>
+      </w:r>
+    </w:p>
+    <w:p>
+      <w:pPr>
+        <w:pStyle w:val="CaptionedFigure"/>
+      </w:pPr>
+      <w:r>
+        <w:drawing>
+          <wp:inline>
+            <wp:extent cx="4992624" cy="2630043"/>
+            <wp:effectExtent b="0" l="0" r="0" t="0"/>
+            <wp:docPr descr="Figure 20 – Grafana Heart Risk API dashboard after the load tests: about 8.1 k predictions, p95 latency around 15 ms, no 5xx errors, 44 % positive share and the predicted-probability distribution" title="" id="141" name="Picture"/>
+            <a:graphic>
+              <a:graphicData uri="http://schemas.openxmlformats.org/drawingml/2006/picture">
+                <pic:pic>
+                  <pic:nvPicPr>
+                    <pic:cNvPr descr="../screenshots/grafana_dashboard.png" id="142" name="Picture"/>
+                    <pic:cNvPicPr>
+                      <a:picLocks noChangeArrowheads="1" noChangeAspect="1"/>
+                    </pic:cNvPicPr>
+                  </pic:nvPicPr>
+                  <pic:blipFill>
+                    <a:blip r:embed="rId140"/>
+                    <a:stretch>
+                      <a:fillRect/>
+                    </a:stretch>
+                  </pic:blipFill>
+                  <pic:spPr bwMode="auto">
+                    <a:xfrm>
+                      <a:off x="0" y="0"/>
+                      <a:ext cx="4992624" cy="2630043"/>
+                    </a:xfrm>
+                    <a:prstGeom prst="rect">
+                      <a:avLst/>
+                    </a:prstGeom>
+                    <a:noFill/>
+                    <a:ln w="9525">
+                      <a:noFill/>
+                      <a:headEnd/>
+                      <a:tailEnd/>
+                    </a:ln>
+                  </pic:spPr>
+                </pic:pic>
+              </a:graphicData>
+            </a:graphic>
+          </wp:inline>
+        </w:drawing>
+      </w:r>
+    </w:p>
+    <w:p>
+      <w:pPr>
+        <w:pStyle w:val="ImageCaption"/>
+      </w:pPr>
+      <w:r>
+        <w:t xml:space="preserve">Figure 20 – Grafana</w:t>
+      </w:r>
+      <w:r>
+        <w:t xml:space="preserve"> </w:t>
+      </w:r>
       <w:r>
         <w:rPr>
           <w:i/>
           <w:iCs/>
         </w:rPr>
-        <w:t xml:space="preserve">Figures 17–18: Prometheus targets and the Grafana dashboard. Screenshots go here:</w:t>
-      </w:r>
-      <w:r>
-        <w:rPr>
-          <w:i/>
-          <w:iCs/>
-        </w:rPr>
-        <w:t xml:space="preserve"> </w:t>
-      </w:r>
-      <w:r>
-        <w:rPr>
-          <w:rStyle w:val="VerbatimChar"/>
-          <w:i/>
-          <w:iCs/>
-        </w:rPr>
-        <w:t xml:space="preserve">screenshots/prometheus_targets.png</w:t>
-      </w:r>
-      <w:r>
-        <w:rPr>
-          <w:i/>
-          <w:iCs/>
-        </w:rPr>
-        <w:t xml:space="preserve">,</w:t>
-      </w:r>
-      <w:r>
-        <w:rPr>
-          <w:i/>
-          <w:iCs/>
-        </w:rPr>
-        <w:t xml:space="preserve"> </w:t>
-      </w:r>
-      <w:r>
-        <w:rPr>
-          <w:rStyle w:val="VerbatimChar"/>
-          <w:i/>
-          <w:iCs/>
-        </w:rPr>
-        <w:t xml:space="preserve">screenshots/grafana_dashboard.png</w:t>
-      </w:r>
-      <w:r>
-        <w:rPr>
-          <w:i/>
-          <w:iCs/>
-        </w:rPr>
-        <w:t xml:space="preserve">.</w:t>
-      </w:r>
-    </w:p>
-    <w:bookmarkEnd w:id="63"/>
-    <w:bookmarkStart w:id="64" w:name="reflections-and-next-steps"/>
+        <w:t xml:space="preserve">Heart Risk API</w:t>
+      </w:r>
+      <w:r>
+        <w:t xml:space="preserve"> </w:t>
+      </w:r>
+      <w:r>
+        <w:t xml:space="preserve">dashboard after the load tests: about 8.1 k predictions, p95 latency around 15 ms, no 5xx errors, 44 % positive share and the predicted-probability distribution</w:t>
+      </w:r>
+    </w:p>
+    <w:bookmarkEnd w:id="143"/>
+    <w:bookmarkStart w:id="144" w:name="reflections-and-next-steps"/>
     <w:p>
       <w:pPr>
         <w:pStyle w:val="Heading1"/>
@@ -6730,7 +7282,7 @@
         <w:pStyle w:val="Compact"/>
         <w:numPr>
           <w:ilvl w:val="0"/>
-          <w:numId w:val="1006"/>
+          <w:numId w:val="1007"/>
         </w:numPr>
       </w:pPr>
       <w:r>
@@ -6767,7 +7319,7 @@
         <w:pStyle w:val="Compact"/>
         <w:numPr>
           <w:ilvl w:val="0"/>
-          <w:numId w:val="1006"/>
+          <w:numId w:val="1007"/>
         </w:numPr>
       </w:pPr>
       <w:r>
@@ -6789,7 +7341,7 @@
         <w:pStyle w:val="Compact"/>
         <w:numPr>
           <w:ilvl w:val="0"/>
-          <w:numId w:val="1006"/>
+          <w:numId w:val="1007"/>
         </w:numPr>
       </w:pPr>
       <w:r>
@@ -6806,8 +7358,8 @@
         <w:t xml:space="preserve">Push the image to a registry and add a CD job that deploys to a cloud cluster; use a shared MLflow server with registry stage transitions as the promotion gate; add calibration (Platt or isotonic) and SHAP explanations in the API response; build a scheduled drift job that compares logged inputs with the training distribution (PSI or KS) and triggers retraining.</w:t>
       </w:r>
     </w:p>
-    <w:bookmarkEnd w:id="64"/>
-    <w:bookmarkStart w:id="65" w:name="appendix-a-reproduce-everything"/>
+    <w:bookmarkEnd w:id="144"/>
+    <w:bookmarkStart w:id="145" w:name="appendix-a-reproduce-everything"/>
     <w:p>
       <w:pPr>
         <w:pStyle w:val="Heading1"/>
@@ -7032,6 +7584,27 @@
       </w:r>
       <w:r>
         <w:rPr>
+          <w:rStyle w:val="ExtensionTok"/>
+        </w:rPr>
+        <w:t xml:space="preserve">./scripts/run_linux.sh</w:t>
+      </w:r>
+      <w:r>
+        <w:rPr>
+          <w:rStyle w:val="NormalTok"/>
+        </w:rPr>
+        <w:t xml:space="preserve">                </w:t>
+      </w:r>
+      <w:r>
+        <w:rPr>
+          <w:rStyle w:val="CommentTok"/>
+        </w:rPr>
+        <w:t xml:space="preserve"># Linux: interactive menu for all of the above</w:t>
+      </w:r>
+      <w:r>
+        <w:br/>
+      </w:r>
+      <w:r>
+        <w:rPr>
           <w:rStyle w:val="FunctionTok"/>
         </w:rPr>
         <w:t xml:space="preserve">make</w:t>
@@ -7049,11 +7622,13 @@
         <w:t xml:space="preserve"># http://localhost:5000</w:t>
       </w:r>
     </w:p>
-    <w:bookmarkEnd w:id="65"/>
+    <w:bookmarkEnd w:id="145"/>
     <w:sectPr>
       <w:footnotePr>
         <w:numRestart w:val="eachSect"/>
       </w:footnotePr>
+      <w:pgSz w:h="16838" w:w="11906"/>
+      <w:pgMar w:bottom="794" w:left="907" w:right="907" w:top="794"/>
     </w:sectPr>
   </w:body>
 </w:document>
@@ -7396,6 +7971,9 @@
   <w:num w:numId="1006">
     <w:abstractNumId w:val="991"/>
   </w:num>
+  <w:num w:numId="1007">
+    <w:abstractNumId w:val="991"/>
+  </w:num>
 </w:numbering>
 </file>
 
@@ -7420,6 +7998,12 @@
   <w:style w:default="1" w:styleId="Normal" w:type="paragraph">
     <w:name w:val="Normal"/>
     <w:qFormat/>
+    <w:pPr>
+      <w:spacing w:after="80" w:before="0"/>
+    </w:pPr>
+    <w:rPr>
+      <w:sz w:val="20"/>
+    </w:rPr>
   </w:style>
   <w:style w:styleId="BodyText" w:type="paragraph">
     <w:name w:val="Body Text"/>
@@ -7427,22 +8011,34 @@
     <w:link w:val="BodyTextChar"/>
     <w:qFormat/>
     <w:pPr>
-      <w:spacing w:after="180" w:before="180"/>
+      <w:spacing w:after="80" w:before="0"/>
     </w:pPr>
+    <w:rPr>
+      <w:sz w:val="20"/>
+    </w:rPr>
   </w:style>
   <w:style w:customStyle="1" w:styleId="FirstParagraph" w:type="paragraph">
     <w:name w:val="First Paragraph"/>
     <w:basedOn w:val="BodyText"/>
     <w:next w:val="BodyText"/>
     <w:qFormat/>
+    <w:pPr>
+      <w:spacing w:after="80" w:before="0"/>
+    </w:pPr>
+    <w:rPr>
+      <w:sz w:val="20"/>
+    </w:rPr>
   </w:style>
   <w:style w:customStyle="1" w:styleId="Compact" w:type="paragraph">
     <w:name w:val="Compact"/>
     <w:basedOn w:val="BodyText"/>
     <w:qFormat/>
     <w:pPr>
-      <w:spacing w:after="36" w:before="36"/>
+      <w:spacing w:after="80" w:before="0"/>
     </w:pPr>
+    <w:rPr>
+      <w:sz w:val="20"/>
+    </w:rPr>
   </w:style>
   <w:style w:styleId="Title" w:type="paragraph">
     <w:name w:val="Title"/>
@@ -7453,13 +8049,13 @@
     <w:qFormat/>
     <w:rsid w:val="00A10FD9"/>
     <w:pPr>
-      <w:spacing w:after="80" w:line="240" w:lineRule="auto"/>
+      <w:spacing w:after="40" w:before="0" w:line="240" w:lineRule="auto"/>
       <w:contextualSpacing/>
       <w:jc w:val="center"/>
     </w:pPr>
     <w:rPr>
       <w:rFonts w:asciiTheme="majorHAnsi" w:cstheme="majorBidi" w:eastAsiaTheme="majorEastAsia" w:hAnsiTheme="majorHAnsi"/>
-      <w:sz w:val="56"/>
+      <w:sz w:val="40"/>
       <w:szCs w:val="56"/>
     </w:rPr>
   </w:style>
@@ -7487,11 +8083,12 @@
       <w:numPr>
         <w:ilvl w:val="1"/>
       </w:numPr>
+      <w:spacing w:after="40" w:before="0"/>
     </w:pPr>
     <w:rPr>
       <w:rFonts w:cstheme="majorBidi" w:eastAsiaTheme="majorEastAsia"/>
       <w:spacing w:val="15"/>
-      <w:sz w:val="28"/>
+      <w:sz w:val="24"/>
       <w:szCs w:val="28"/>
     </w:rPr>
   </w:style>
@@ -7588,13 +8185,13 @@
     <w:pPr>
       <w:keepNext/>
       <w:keepLines/>
-      <w:spacing w:after="80" w:before="360"/>
+      <w:spacing w:after="60" w:before="200"/>
       <w:outlineLvl w:val="0"/>
     </w:pPr>
     <w:rPr>
       <w:rFonts w:asciiTheme="majorHAnsi" w:cstheme="majorBidi" w:eastAsiaTheme="majorEastAsia" w:hAnsiTheme="majorHAnsi"/>
       <w:color w:themeColor="accent1" w:themeShade="BF" w:val="0F4761"/>
-      <w:sz w:val="40"/>
+      <w:sz w:val="28"/>
       <w:szCs w:val="40"/>
     </w:rPr>
   </w:style>
@@ -7611,13 +8208,13 @@
     <w:pPr>
       <w:keepNext/>
       <w:keepLines/>
-      <w:spacing w:after="80" w:before="160"/>
+      <w:spacing w:after="40" w:before="120"/>
       <w:outlineLvl w:val="1"/>
     </w:pPr>
     <w:rPr>
       <w:rFonts w:asciiTheme="majorHAnsi" w:cstheme="majorBidi" w:eastAsiaTheme="majorEastAsia" w:hAnsiTheme="majorHAnsi"/>
       <w:color w:themeColor="accent1" w:themeShade="BF" w:val="0F4761"/>
-      <w:sz w:val="32"/>
+      <w:sz w:val="24"/>
       <w:szCs w:val="32"/>
     </w:rPr>
   </w:style>
@@ -7634,13 +8231,13 @@
     <w:pPr>
       <w:keepNext/>
       <w:keepLines/>
-      <w:spacing w:after="80" w:before="160"/>
+      <w:spacing w:after="40" w:before="80"/>
       <w:outlineLvl w:val="2"/>
     </w:pPr>
     <w:rPr>
       <w:rFonts w:cstheme="majorBidi" w:eastAsiaTheme="majorEastAsia"/>
       <w:color w:themeColor="accent1" w:themeShade="BF" w:val="0F4761"/>
-      <w:sz w:val="28"/>
+      <w:sz w:val="21"/>
       <w:szCs w:val="28"/>
     </w:rPr>
   </w:style>
@@ -7994,6 +8591,12 @@
   <w:style w:customStyle="1" w:styleId="ImageCaption" w:type="paragraph">
     <w:name w:val="Image Caption"/>
     <w:basedOn w:val="Caption"/>
+    <w:pPr>
+      <w:spacing w:after="120" w:before="0"/>
+    </w:pPr>
+    <w:rPr>
+      <w:sz w:val="17"/>
+    </w:rPr>
   </w:style>
   <w:style w:customStyle="1" w:styleId="Figure" w:type="paragraph">
     <w:name w:val="Figure"/>
@@ -8004,6 +8607,7 @@
     <w:basedOn w:val="Figure"/>
     <w:pPr>
       <w:keepNext/>
+      <w:spacing w:after="0" w:before="80"/>
     </w:pPr>
   </w:style>
   <w:style w:customStyle="1" w:styleId="BodyTextChar" w:type="character">
@@ -8016,7 +8620,7 @@
     <w:basedOn w:val="BodyTextChar"/>
     <w:rPr>
       <w:rFonts w:ascii="Consolas" w:hAnsi="Consolas"/>
-      <w:sz w:val="22"/>
+      <w:sz w:val="17"/>
     </w:rPr>
   </w:style>
   <w:style w:customStyle="1" w:styleId="SectionNumber" w:type="character">
@@ -8055,15 +8659,19 @@
       <w:color w:themeColor="accent1" w:themeShade="BF" w:val="365F91"/>
     </w:rPr>
   </w:style>
-  <w:style w:type="paragraph" w:customStyle="1" w:styleId="SourceCode">
+  <w:style w:customStyle="1" w:styleId="SourceCode" w:type="paragraph">
     <w:name w:val="Source Code"/>
     <w:basedOn w:val="Normal"/>
     <w:link w:val="VerbatimChar"/>
     <w:pPr>
       <w:wordWrap w:val="off"/>
+      <w:spacing w:after="80" w:before="40"/>
     </w:pPr>
+    <w:rPr>
+      <w:sz w:val="15"/>
+    </w:rPr>
   </w:style>
-  <w:style w:type="character" w:customStyle="1" w:styleId="KeywordTok">
+  <w:style w:customStyle="1" w:styleId="KeywordTok" w:type="character">
     <w:name w:val="KeywordTok"/>
     <w:basedOn w:val="VerbatimChar"/>
     <w:rPr>
@@ -8071,77 +8679,77 @@
       <w:color w:val="007020"/>
     </w:rPr>
   </w:style>
-  <w:style w:type="character" w:customStyle="1" w:styleId="DataTypeTok">
+  <w:style w:customStyle="1" w:styleId="DataTypeTok" w:type="character">
     <w:name w:val="DataTypeTok"/>
     <w:basedOn w:val="VerbatimChar"/>
     <w:rPr>
       <w:color w:val="902000"/>
     </w:rPr>
   </w:style>
-  <w:style w:type="character" w:customStyle="1" w:styleId="DecValTok">
+  <w:style w:customStyle="1" w:styleId="DecValTok" w:type="character">
     <w:name w:val="DecValTok"/>
     <w:basedOn w:val="VerbatimChar"/>
     <w:rPr>
       <w:color w:val="40a070"/>
     </w:rPr>
   </w:style>
-  <w:style w:type="character" w:customStyle="1" w:styleId="BaseNTok">
+  <w:style w:customStyle="1" w:styleId="BaseNTok" w:type="character">
     <w:name w:val="BaseNTok"/>
     <w:basedOn w:val="VerbatimChar"/>
     <w:rPr>
       <w:color w:val="40a070"/>
     </w:rPr>
   </w:style>
-  <w:style w:type="character" w:customStyle="1" w:styleId="FloatTok">
+  <w:style w:customStyle="1" w:styleId="FloatTok" w:type="character">
     <w:name w:val="FloatTok"/>
     <w:basedOn w:val="VerbatimChar"/>
     <w:rPr>
       <w:color w:val="40a070"/>
     </w:rPr>
   </w:style>
-  <w:style w:type="character" w:customStyle="1" w:styleId="ConstantTok">
+  <w:style w:customStyle="1" w:styleId="ConstantTok" w:type="character">
     <w:name w:val="ConstantTok"/>
     <w:basedOn w:val="VerbatimChar"/>
     <w:rPr>
       <w:color w:val="880000"/>
     </w:rPr>
   </w:style>
-  <w:style w:type="character" w:customStyle="1" w:styleId="CharTok">
+  <w:style w:customStyle="1" w:styleId="CharTok" w:type="character">
     <w:name w:val="CharTok"/>
     <w:basedOn w:val="VerbatimChar"/>
     <w:rPr>
       <w:color w:val="4070a0"/>
     </w:rPr>
   </w:style>
-  <w:style w:type="character" w:customStyle="1" w:styleId="SpecialCharTok">
+  <w:style w:customStyle="1" w:styleId="SpecialCharTok" w:type="character">
     <w:name w:val="SpecialCharTok"/>
     <w:basedOn w:val="VerbatimChar"/>
     <w:rPr>
       <w:color w:val="4070a0"/>
     </w:rPr>
   </w:style>
-  <w:style w:type="character" w:customStyle="1" w:styleId="StringTok">
+  <w:style w:customStyle="1" w:styleId="StringTok" w:type="character">
     <w:name w:val="StringTok"/>
     <w:basedOn w:val="VerbatimChar"/>
     <w:rPr>
       <w:color w:val="4070a0"/>
     </w:rPr>
   </w:style>
-  <w:style w:type="character" w:customStyle="1" w:styleId="VerbatimStringTok">
+  <w:style w:customStyle="1" w:styleId="VerbatimStringTok" w:type="character">
     <w:name w:val="VerbatimStringTok"/>
     <w:basedOn w:val="VerbatimChar"/>
     <w:rPr>
       <w:color w:val="4070a0"/>
     </w:rPr>
   </w:style>
-  <w:style w:type="character" w:customStyle="1" w:styleId="SpecialStringTok">
+  <w:style w:customStyle="1" w:styleId="SpecialStringTok" w:type="character">
     <w:name w:val="SpecialStringTok"/>
     <w:basedOn w:val="VerbatimChar"/>
     <w:rPr>
       <w:color w:val="bb6688"/>
     </w:rPr>
   </w:style>
-  <w:style w:type="character" w:customStyle="1" w:styleId="ImportTok">
+  <w:style w:customStyle="1" w:styleId="ImportTok" w:type="character">
     <w:name w:val="ImportTok"/>
     <w:basedOn w:val="VerbatimChar"/>
     <w:rPr>
@@ -8149,7 +8757,7 @@
       <w:color w:val="008000"/>
     </w:rPr>
   </w:style>
-  <w:style w:type="character" w:customStyle="1" w:styleId="CommentTok">
+  <w:style w:customStyle="1" w:styleId="CommentTok" w:type="character">
     <w:name w:val="CommentTok"/>
     <w:basedOn w:val="VerbatimChar"/>
     <w:rPr>
@@ -8157,7 +8765,7 @@
       <w:color w:val="60a0b0"/>
     </w:rPr>
   </w:style>
-  <w:style w:type="character" w:customStyle="1" w:styleId="DocumentationTok">
+  <w:style w:customStyle="1" w:styleId="DocumentationTok" w:type="character">
     <w:name w:val="DocumentationTok"/>
     <w:basedOn w:val="VerbatimChar"/>
     <w:rPr>
@@ -8165,7 +8773,7 @@
       <w:color w:val="ba2121"/>
     </w:rPr>
   </w:style>
-  <w:style w:type="character" w:customStyle="1" w:styleId="AnnotationTok">
+  <w:style w:customStyle="1" w:styleId="AnnotationTok" w:type="character">
     <w:name w:val="AnnotationTok"/>
     <w:basedOn w:val="VerbatimChar"/>
     <w:rPr>
@@ -8174,7 +8782,7 @@
       <w:color w:val="60a0b0"/>
     </w:rPr>
   </w:style>
-  <w:style w:type="character" w:customStyle="1" w:styleId="CommentVarTok">
+  <w:style w:customStyle="1" w:styleId="CommentVarTok" w:type="character">
     <w:name w:val="CommentVarTok"/>
     <w:basedOn w:val="VerbatimChar"/>
     <w:rPr>
@@ -8183,28 +8791,28 @@
       <w:color w:val="60a0b0"/>
     </w:rPr>
   </w:style>
-  <w:style w:type="character" w:customStyle="1" w:styleId="OtherTok">
+  <w:style w:customStyle="1" w:styleId="OtherTok" w:type="character">
     <w:name w:val="OtherTok"/>
     <w:basedOn w:val="VerbatimChar"/>
     <w:rPr>
       <w:color w:val="007020"/>
     </w:rPr>
   </w:style>
-  <w:style w:type="character" w:customStyle="1" w:styleId="FunctionTok">
+  <w:style w:customStyle="1" w:styleId="FunctionTok" w:type="character">
     <w:name w:val="FunctionTok"/>
     <w:basedOn w:val="VerbatimChar"/>
     <w:rPr>
       <w:color w:val="06287e"/>
     </w:rPr>
   </w:style>
-  <w:style w:type="character" w:customStyle="1" w:styleId="VariableTok">
+  <w:style w:customStyle="1" w:styleId="VariableTok" w:type="character">
     <w:name w:val="VariableTok"/>
     <w:basedOn w:val="VerbatimChar"/>
     <w:rPr>
       <w:color w:val="19177c"/>
     </w:rPr>
   </w:style>
-  <w:style w:type="character" w:customStyle="1" w:styleId="ControlFlowTok">
+  <w:style w:customStyle="1" w:styleId="ControlFlowTok" w:type="character">
     <w:name w:val="ControlFlowTok"/>
     <w:basedOn w:val="VerbatimChar"/>
     <w:rPr>
@@ -8212,45 +8820,45 @@
       <w:color w:val="007020"/>
     </w:rPr>
   </w:style>
-  <w:style w:type="character" w:customStyle="1" w:styleId="OperatorTok">
+  <w:style w:customStyle="1" w:styleId="OperatorTok" w:type="character">
     <w:name w:val="OperatorTok"/>
     <w:basedOn w:val="VerbatimChar"/>
     <w:rPr>
       <w:color w:val="666666"/>
     </w:rPr>
   </w:style>
-  <w:style w:type="character" w:customStyle="1" w:styleId="BuiltInTok">
+  <w:style w:customStyle="1" w:styleId="BuiltInTok" w:type="character">
     <w:name w:val="BuiltInTok"/>
     <w:basedOn w:val="VerbatimChar"/>
     <w:rPr>
       <w:color w:val="008000"/>
     </w:rPr>
   </w:style>
-  <w:style w:type="character" w:customStyle="1" w:styleId="ExtensionTok">
+  <w:style w:customStyle="1" w:styleId="ExtensionTok" w:type="character">
     <w:name w:val="ExtensionTok"/>
     <w:basedOn w:val="VerbatimChar"/>
     <w:rPr/>
   </w:style>
-  <w:style w:type="character" w:customStyle="1" w:styleId="PreprocessorTok">
+  <w:style w:customStyle="1" w:styleId="PreprocessorTok" w:type="character">
     <w:name w:val="PreprocessorTok"/>
     <w:basedOn w:val="VerbatimChar"/>
     <w:rPr>
       <w:color w:val="bc7a00"/>
     </w:rPr>
   </w:style>
-  <w:style w:type="character" w:customStyle="1" w:styleId="AttributeTok">
+  <w:style w:customStyle="1" w:styleId="AttributeTok" w:type="character">
     <w:name w:val="AttributeTok"/>
     <w:basedOn w:val="VerbatimChar"/>
     <w:rPr>
       <w:color w:val="7d9029"/>
     </w:rPr>
   </w:style>
-  <w:style w:type="character" w:customStyle="1" w:styleId="RegionMarkerTok">
+  <w:style w:customStyle="1" w:styleId="RegionMarkerTok" w:type="character">
     <w:name w:val="RegionMarkerTok"/>
     <w:basedOn w:val="VerbatimChar"/>
     <w:rPr/>
   </w:style>
-  <w:style w:type="character" w:customStyle="1" w:styleId="InformationTok">
+  <w:style w:customStyle="1" w:styleId="InformationTok" w:type="character">
     <w:name w:val="InformationTok"/>
     <w:basedOn w:val="VerbatimChar"/>
     <w:rPr>
@@ -8259,7 +8867,7 @@
       <w:color w:val="60a0b0"/>
     </w:rPr>
   </w:style>
-  <w:style w:type="character" w:customStyle="1" w:styleId="WarningTok">
+  <w:style w:customStyle="1" w:styleId="WarningTok" w:type="character">
     <w:name w:val="WarningTok"/>
     <w:basedOn w:val="VerbatimChar"/>
     <w:rPr>
@@ -8268,7 +8876,7 @@
       <w:color w:val="60a0b0"/>
     </w:rPr>
   </w:style>
-  <w:style w:type="character" w:customStyle="1" w:styleId="AlertTok">
+  <w:style w:customStyle="1" w:styleId="AlertTok" w:type="character">
     <w:name w:val="AlertTok"/>
     <w:basedOn w:val="VerbatimChar"/>
     <w:rPr>
@@ -8276,7 +8884,7 @@
       <w:color w:val="ff0000"/>
     </w:rPr>
   </w:style>
-  <w:style w:type="character" w:customStyle="1" w:styleId="ErrorTok">
+  <w:style w:customStyle="1" w:styleId="ErrorTok" w:type="character">
     <w:name w:val="ErrorTok"/>
     <w:basedOn w:val="VerbatimChar"/>
     <w:rPr>
@@ -8284,7 +8892,7 @@
       <w:color w:val="ff0000"/>
     </w:rPr>
   </w:style>
-  <w:style w:type="character" w:customStyle="1" w:styleId="NormalTok">
+  <w:style w:customStyle="1" w:styleId="NormalTok" w:type="character">
     <w:name w:val="NormalTok"/>
     <w:basedOn w:val="VerbatimChar"/>
     <w:rPr/>

</xml_diff>

<commit_message>
Report: add BITS ID
Co-Authored-By: Claude Opus 5.5 <noreply@anthropic.com>
</commit_message>
<xml_diff>
--- a/reports/MLOps_Assignment1_Report.docx
+++ b/reports/MLOps_Assignment1_Report.docx
@@ -26,10 +26,7 @@
         <w:t xml:space="preserve"> </w:t>
       </w:r>
       <w:r>
-        <w:t xml:space="preserve">·</w:t>
-      </w:r>
-      <w:r>
-        <w:t xml:space="preserve"> </w:t>
+        <w:t xml:space="preserve">· 2025AE05637</w:t>
       </w:r>
     </w:p>
     <w:p>

</xml_diff>

<commit_message>
Report: add author name
Co-Authored-By: Claude Opus 5.5 <noreply@anthropic.com>
</commit_message>
<xml_diff>
--- a/reports/MLOps_Assignment1_Report.docx
+++ b/reports/MLOps_Assignment1_Report.docx
@@ -23,10 +23,7 @@
         <w:pStyle w:val="Author"/>
       </w:pPr>
       <w:r>
-        <w:t xml:space="preserve"> </w:t>
-      </w:r>
-      <w:r>
-        <w:t xml:space="preserve">· 2025AE05637</w:t>
+        <w:t xml:space="preserve">Ankit Bhargava · BITS ID 2025AE05637</w:t>
       </w:r>
     </w:p>
     <w:p>

</xml_diff>

<commit_message>
Add video walkthrough link
Co-Authored-By: Claude Opus 5.5 <noreply@anthropic.com>
</commit_message>
<xml_diff>
--- a/reports/MLOps_Assignment1_Report.docx
+++ b/reports/MLOps_Assignment1_Report.docx
@@ -85,14 +85,16 @@
       <w:r>
         <w:t xml:space="preserve"> </w:t>
       </w:r>
-      <w:r>
-        <w:rPr>
-          <w:rStyle w:val="VerbatimChar"/>
-        </w:rPr>
-        <w:t xml:space="preserve">&lt;add link&gt;</w:t>
-      </w:r>
-    </w:p>
-    <w:bookmarkStart w:id="65" w:name="overview"/>
+      <w:hyperlink r:id="rId62">
+        <w:r>
+          <w:rPr>
+            <w:rStyle w:val="Hyperlink"/>
+          </w:rPr>
+          <w:t xml:space="preserve">Google Drive (9 min 43 s)</w:t>
+        </w:r>
+      </w:hyperlink>
+    </w:p>
+    <w:bookmarkStart w:id="66" w:name="overview"/>
     <w:p>
       <w:pPr>
         <w:pStyle w:val="Heading1"/>
@@ -193,18 +195,18 @@
           <wp:inline>
             <wp:extent cx="4480560" cy="2128266"/>
             <wp:effectExtent b="0" l="0" r="0" t="0"/>
-            <wp:docPr descr="Figure 1 – System architecture" title="" id="63" name="Picture"/>
+            <wp:docPr descr="Figure 1 – System architecture" title="" id="64" name="Picture"/>
             <a:graphic>
               <a:graphicData uri="http://schemas.openxmlformats.org/drawingml/2006/picture">
                 <pic:pic>
                   <pic:nvPicPr>
-                    <pic:cNvPr descr="figures/arch/architecture.png" id="64" name="Picture"/>
+                    <pic:cNvPr descr="figures/arch/architecture.png" id="65" name="Picture"/>
                     <pic:cNvPicPr>
                       <a:picLocks noChangeArrowheads="1" noChangeAspect="1"/>
                     </pic:cNvPicPr>
                   </pic:nvPicPr>
                   <pic:blipFill>
-                    <a:blip r:embed="rId62"/>
+                    <a:blip r:embed="rId63"/>
                     <a:stretch>
                       <a:fillRect/>
                     </a:stretch>
@@ -353,8 +355,8 @@
         <w:t xml:space="preserve">The 20 % hold-out set is touched once, to report an unbiased estimate. It is never used to choose a model.</w:t>
       </w:r>
     </w:p>
-    <w:bookmarkEnd w:id="65"/>
-    <w:bookmarkStart w:id="85" w:name="data-acquisition-and-eda"/>
+    <w:bookmarkEnd w:id="66"/>
+    <w:bookmarkStart w:id="86" w:name="data-acquisition-and-eda"/>
     <w:p>
       <w:pPr>
         <w:pStyle w:val="Heading1"/>
@@ -363,7 +365,7 @@
         <w:t xml:space="preserve">2. Data acquisition and EDA</w:t>
       </w:r>
     </w:p>
-    <w:bookmarkStart w:id="66" w:name="acquisition"/>
+    <w:bookmarkStart w:id="67" w:name="acquisition"/>
     <w:p>
       <w:pPr>
         <w:pStyle w:val="Heading2"/>
@@ -464,8 +466,8 @@
         <w:t xml:space="preserve">. The download is skipped when the files already exist, so the step is idempotent.</w:t>
       </w:r>
     </w:p>
-    <w:bookmarkEnd w:id="66"/>
-    <w:bookmarkStart w:id="70" w:name="choosing-the-subset"/>
+    <w:bookmarkEnd w:id="67"/>
+    <w:bookmarkStart w:id="71" w:name="choosing-the-subset"/>
     <w:p>
       <w:pPr>
         <w:pStyle w:val="Heading2"/>
@@ -543,18 +545,18 @@
           <wp:inline>
             <wp:extent cx="4480560" cy="1433779"/>
             <wp:effectExtent b="0" l="0" r="0" t="0"/>
-            <wp:docPr descr="Figure 2 – Missingness per site after cleaning" title="" id="68" name="Picture"/>
+            <wp:docPr descr="Figure 2 – Missingness per site after cleaning" title="" id="69" name="Picture"/>
             <a:graphic>
               <a:graphicData uri="http://schemas.openxmlformats.org/drawingml/2006/picture">
                 <pic:pic>
                   <pic:nvPicPr>
-                    <pic:cNvPr descr="figures/eda/07_missingness_by_source.png" id="69" name="Picture"/>
+                    <pic:cNvPr descr="figures/eda/07_missingness_by_source.png" id="70" name="Picture"/>
                     <pic:cNvPicPr>
                       <a:picLocks noChangeArrowheads="1" noChangeAspect="1"/>
                     </pic:cNvPicPr>
                   </pic:nvPicPr>
                   <pic:blipFill>
-                    <a:blip r:embed="rId67"/>
+                    <a:blip r:embed="rId68"/>
                     <a:stretch>
                       <a:fillRect/>
                     </a:stretch>
@@ -589,8 +591,8 @@
         <w:t xml:space="preserve">Figure 2 – Missingness per site after cleaning</w:t>
       </w:r>
     </w:p>
-    <w:bookmarkEnd w:id="70"/>
-    <w:bookmarkStart w:id="71" w:name="cleaning"/>
+    <w:bookmarkEnd w:id="71"/>
+    <w:bookmarkStart w:id="72" w:name="cleaning"/>
     <w:p>
       <w:pPr>
         <w:pStyle w:val="Heading2"/>
@@ -905,8 +907,8 @@
         <w:t xml:space="preserve">. Everything else is complete.</w:t>
       </w:r>
     </w:p>
-    <w:bookmarkEnd w:id="71"/>
-    <w:bookmarkStart w:id="84" w:name="findings"/>
+    <w:bookmarkEnd w:id="72"/>
+    <w:bookmarkStart w:id="85" w:name="findings"/>
     <w:p>
       <w:pPr>
         <w:pStyle w:val="Heading2"/>
@@ -932,18 +934,18 @@
           <wp:inline>
             <wp:extent cx="2240280" cy="1742440"/>
             <wp:effectExtent b="0" l="0" r="0" t="0"/>
-            <wp:docPr descr="Figure 3 – Class balance" title="" id="73" name="Picture"/>
+            <wp:docPr descr="Figure 3 – Class balance" title="" id="74" name="Picture"/>
             <a:graphic>
               <a:graphicData uri="http://schemas.openxmlformats.org/drawingml/2006/picture">
                 <pic:pic>
                   <pic:nvPicPr>
-                    <pic:cNvPr descr="figures/eda/01_class_balance.png" id="74" name="Picture"/>
+                    <pic:cNvPr descr="figures/eda/01_class_balance.png" id="75" name="Picture"/>
                     <pic:cNvPicPr>
                       <a:picLocks noChangeArrowheads="1" noChangeAspect="1"/>
                     </pic:cNvPicPr>
                   </pic:nvPicPr>
                   <pic:blipFill>
-                    <a:blip r:embed="rId72"/>
+                    <a:blip r:embed="rId73"/>
                     <a:stretch>
                       <a:fillRect/>
                     </a:stretch>
@@ -987,18 +989,18 @@
           <wp:inline>
             <wp:extent cx="4608576" cy="2496312"/>
             <wp:effectExtent b="0" l="0" r="0" t="0"/>
-            <wp:docPr descr="Figure 4 – Numeric features by diagnosis" title="" id="76" name="Picture"/>
+            <wp:docPr descr="Figure 4 – Numeric features by diagnosis" title="" id="77" name="Picture"/>
             <a:graphic>
               <a:graphicData uri="http://schemas.openxmlformats.org/drawingml/2006/picture">
                 <pic:pic>
                   <pic:nvPicPr>
-                    <pic:cNvPr descr="figures/eda/02_numeric_histograms.png" id="77" name="Picture"/>
+                    <pic:cNvPr descr="figures/eda/02_numeric_histograms.png" id="78" name="Picture"/>
                     <pic:cNvPicPr>
                       <a:picLocks noChangeArrowheads="1" noChangeAspect="1"/>
                     </pic:cNvPicPr>
                   </pic:nvPicPr>
                   <pic:blipFill>
-                    <a:blip r:embed="rId75"/>
+                    <a:blip r:embed="rId76"/>
                     <a:stretch>
                       <a:fillRect/>
                     </a:stretch>
@@ -1185,18 +1187,18 @@
           <wp:inline>
             <wp:extent cx="4608576" cy="2139696"/>
             <wp:effectExtent b="0" l="0" r="0" t="0"/>
-            <wp:docPr descr="Figure 5 – Disease rate per categorical level (n shown on bars)" title="" id="79" name="Picture"/>
+            <wp:docPr descr="Figure 5 – Disease rate per categorical level (n shown on bars)" title="" id="80" name="Picture"/>
             <a:graphic>
               <a:graphicData uri="http://schemas.openxmlformats.org/drawingml/2006/picture">
                 <pic:pic>
                   <pic:nvPicPr>
-                    <pic:cNvPr descr="figures/eda/03_categorical_disease_rate.png" id="80" name="Picture"/>
+                    <pic:cNvPr descr="figures/eda/03_categorical_disease_rate.png" id="81" name="Picture"/>
                     <pic:cNvPicPr>
                       <a:picLocks noChangeArrowheads="1" noChangeAspect="1"/>
                     </pic:cNvPicPr>
                   </pic:nvPicPr>
                   <pic:blipFill>
-                    <a:blip r:embed="rId78"/>
+                    <a:blip r:embed="rId79"/>
                     <a:stretch>
                       <a:fillRect/>
                     </a:stretch>
@@ -1240,18 +1242,18 @@
           <wp:inline>
             <wp:extent cx="2944368" cy="2453640"/>
             <wp:effectExtent b="0" l="0" r="0" t="0"/>
-            <wp:docPr descr="Figure 6 – Spearman correlations" title="" id="82" name="Picture"/>
+            <wp:docPr descr="Figure 6 – Spearman correlations" title="" id="83" name="Picture"/>
             <a:graphic>
               <a:graphicData uri="http://schemas.openxmlformats.org/drawingml/2006/picture">
                 <pic:pic>
                   <pic:nvPicPr>
-                    <pic:cNvPr descr="figures/eda/04_correlation_heatmap.png" id="83" name="Picture"/>
+                    <pic:cNvPr descr="figures/eda/04_correlation_heatmap.png" id="84" name="Picture"/>
                     <pic:cNvPicPr>
                       <a:picLocks noChangeArrowheads="1" noChangeAspect="1"/>
                     </pic:cNvPicPr>
                   </pic:nvPicPr>
                   <pic:blipFill>
-                    <a:blip r:embed="rId81"/>
+                    <a:blip r:embed="rId82"/>
                     <a:stretch>
                       <a:fillRect/>
                     </a:stretch>
@@ -1429,9 +1431,9 @@
         <w:t xml:space="preserve">, each with |ρ| ≈ 0.4–0.5.</w:t>
       </w:r>
     </w:p>
-    <w:bookmarkEnd w:id="84"/>
     <w:bookmarkEnd w:id="85"/>
-    <w:bookmarkStart w:id="101" w:name="feature-engineering-and-modelling"/>
+    <w:bookmarkEnd w:id="86"/>
+    <w:bookmarkStart w:id="102" w:name="feature-engineering-and-modelling"/>
     <w:p>
       <w:pPr>
         <w:pStyle w:val="Heading1"/>
@@ -1440,7 +1442,7 @@
         <w:t xml:space="preserve">3. Feature engineering and modelling</w:t>
       </w:r>
     </w:p>
-    <w:bookmarkStart w:id="89" w:name="feature-pipeline"/>
+    <w:bookmarkStart w:id="90" w:name="feature-pipeline"/>
     <w:p>
       <w:pPr>
         <w:pStyle w:val="Heading2"/>
@@ -1651,18 +1653,18 @@
           <wp:inline>
             <wp:extent cx="2880360" cy="2215661"/>
             <wp:effectExtent b="0" l="0" r="0" t="0"/>
-            <wp:docPr descr="Figure 7 – Motivation for the heart-rate-reserve ratio" title="" id="87" name="Picture"/>
+            <wp:docPr descr="Figure 7 – Motivation for the heart-rate-reserve ratio" title="" id="88" name="Picture"/>
             <a:graphic>
               <a:graphicData uri="http://schemas.openxmlformats.org/drawingml/2006/picture">
                 <pic:pic>
                   <pic:nvPicPr>
-                    <pic:cNvPr descr="figures/eda/06_age_vs_thalach.png" id="88" name="Picture"/>
+                    <pic:cNvPr descr="figures/eda/06_age_vs_thalach.png" id="89" name="Picture"/>
                     <pic:cNvPicPr>
                       <a:picLocks noChangeArrowheads="1" noChangeAspect="1"/>
                     </pic:cNvPicPr>
                   </pic:nvPicPr>
                   <pic:blipFill>
-                    <a:blip r:embed="rId86"/>
+                    <a:blip r:embed="rId87"/>
                     <a:stretch>
                       <a:fillRect/>
                     </a:stretch>
@@ -1783,8 +1785,8 @@
         <w:t xml:space="preserve">3/6/7 is not an ordered scale.</w:t>
       </w:r>
     </w:p>
-    <w:bookmarkEnd w:id="89"/>
-    <w:bookmarkStart w:id="90" w:name="candidate-models-and-tuning"/>
+    <w:bookmarkEnd w:id="90"/>
+    <w:bookmarkStart w:id="91" w:name="candidate-models-and-tuning"/>
     <w:p>
       <w:pPr>
         <w:pStyle w:val="Heading2"/>
@@ -2081,8 +2083,8 @@
         <w:t xml:space="preserve">, so the tuning process can be audited.</w:t>
       </w:r>
     </w:p>
-    <w:bookmarkEnd w:id="90"/>
-    <w:bookmarkStart w:id="100" w:name="results"/>
+    <w:bookmarkEnd w:id="91"/>
+    <w:bookmarkStart w:id="101" w:name="results"/>
     <w:p>
       <w:pPr>
         <w:pStyle w:val="Heading2"/>
@@ -2558,18 +2560,18 @@
           <wp:inline>
             <wp:extent cx="3840480" cy="2160270"/>
             <wp:effectExtent b="0" l="0" r="0" t="0"/>
-            <wp:docPr descr="Figure 8 – Cross-validated comparison (mean ± std over 5 folds)" title="" id="92" name="Picture"/>
+            <wp:docPr descr="Figure 8 – Cross-validated comparison (mean ± std over 5 folds)" title="" id="93" name="Picture"/>
             <a:graphic>
               <a:graphicData uri="http://schemas.openxmlformats.org/drawingml/2006/picture">
                 <pic:pic>
                   <pic:nvPicPr>
-                    <pic:cNvPr descr="figures/training/model_comparison.png" id="93" name="Picture"/>
+                    <pic:cNvPr descr="figures/training/model_comparison.png" id="94" name="Picture"/>
                     <pic:cNvPicPr>
                       <a:picLocks noChangeArrowheads="1" noChangeAspect="1"/>
                     </pic:cNvPicPr>
                   </pic:nvPicPr>
                   <pic:blipFill>
-                    <a:blip r:embed="rId91"/>
+                    <a:blip r:embed="rId92"/>
                     <a:stretch>
                       <a:fillRect/>
                     </a:stretch>
@@ -2686,18 +2688,18 @@
           <wp:inline>
             <wp:extent cx="2048256" cy="1843430"/>
             <wp:effectExtent b="0" l="0" r="0" t="0"/>
-            <wp:docPr descr="Figure 9 – Hold-out ROC and confusion matrix (LR)" title="" id="95" name="Picture"/>
+            <wp:docPr descr="Figure 9 – Hold-out ROC and confusion matrix (LR)" title="" id="96" name="Picture"/>
             <a:graphic>
               <a:graphicData uri="http://schemas.openxmlformats.org/drawingml/2006/picture">
                 <pic:pic>
                   <pic:nvPicPr>
-                    <pic:cNvPr descr="figures/training/roc_logistic_regression.png" id="96" name="Picture"/>
+                    <pic:cNvPr descr="figures/training/roc_logistic_regression.png" id="97" name="Picture"/>
                     <pic:cNvPicPr>
                       <a:picLocks noChangeArrowheads="1" noChangeAspect="1"/>
                     </pic:cNvPicPr>
                   </pic:nvPicPr>
                   <pic:blipFill>
-                    <a:blip r:embed="rId94"/>
+                    <a:blip r:embed="rId95"/>
                     <a:stretch>
                       <a:fillRect/>
                     </a:stretch>
@@ -2731,18 +2733,18 @@
           <wp:inline>
             <wp:extent cx="1920240" cy="1706880"/>
             <wp:effectExtent b="0" l="0" r="0" t="0"/>
-            <wp:docPr descr="" title="" id="98" name="Picture"/>
+            <wp:docPr descr="" title="" id="99" name="Picture"/>
             <a:graphic>
               <a:graphicData uri="http://schemas.openxmlformats.org/drawingml/2006/picture">
                 <pic:pic>
                   <pic:nvPicPr>
-                    <pic:cNvPr descr="figures/training/confusion_logistic_regression.png" id="99" name="Picture"/>
+                    <pic:cNvPr descr="figures/training/confusion_logistic_regression.png" id="100" name="Picture"/>
                     <pic:cNvPicPr>
                       <a:picLocks noChangeArrowheads="1" noChangeAspect="1"/>
                     </pic:cNvPicPr>
                   </pic:nvPicPr>
                   <pic:blipFill>
-                    <a:blip r:embed="rId97"/>
+                    <a:blip r:embed="rId98"/>
                     <a:stretch>
                       <a:fillRect/>
                     </a:stretch>
@@ -2906,9 +2908,9 @@
         <w:t xml:space="preserve">and saved as the shipped artefact.</w:t>
       </w:r>
     </w:p>
-    <w:bookmarkEnd w:id="100"/>
     <w:bookmarkEnd w:id="101"/>
-    <w:bookmarkStart w:id="108" w:name="experiment-tracking-mlflow"/>
+    <w:bookmarkEnd w:id="102"/>
+    <w:bookmarkStart w:id="109" w:name="experiment-tracking-mlflow"/>
     <w:p>
       <w:pPr>
         <w:pStyle w:val="Heading1"/>
@@ -3378,18 +3380,18 @@
           <wp:inline>
             <wp:extent cx="3136392" cy="1960244"/>
             <wp:effectExtent b="0" l="0" r="0" t="0"/>
-            <wp:docPr descr="" title="" id="103" name="Picture"/>
+            <wp:docPr descr="" title="" id="104" name="Picture"/>
             <a:graphic>
               <a:graphicData uri="http://schemas.openxmlformats.org/drawingml/2006/picture">
                 <pic:pic>
                   <pic:nvPicPr>
-                    <pic:cNvPr descr="../screenshots/mlflow_experiment_runs.png" id="104" name="Picture"/>
+                    <pic:cNvPr descr="../screenshots/mlflow_experiment_runs.png" id="105" name="Picture"/>
                     <pic:cNvPicPr>
                       <a:picLocks noChangeArrowheads="1" noChangeAspect="1"/>
                     </pic:cNvPicPr>
                   </pic:nvPicPr>
                   <pic:blipFill>
-                    <a:blip r:embed="rId102"/>
+                    <a:blip r:embed="rId103"/>
                     <a:stretch>
                       <a:fillRect/>
                     </a:stretch>
@@ -3423,18 +3425,18 @@
           <wp:inline>
             <wp:extent cx="3136392" cy="1960244"/>
             <wp:effectExtent b="0" l="0" r="0" t="0"/>
-            <wp:docPr descr="" title="" id="106" name="Picture"/>
+            <wp:docPr descr="" title="" id="107" name="Picture"/>
             <a:graphic>
               <a:graphicData uri="http://schemas.openxmlformats.org/drawingml/2006/picture">
                 <pic:pic>
                   <pic:nvPicPr>
-                    <pic:cNvPr descr="../screenshots/mlflow_run_artifacts.png" id="107" name="Picture"/>
+                    <pic:cNvPr descr="../screenshots/mlflow_run_artifacts.png" id="108" name="Picture"/>
                     <pic:cNvPicPr>
                       <a:picLocks noChangeArrowheads="1" noChangeAspect="1"/>
                     </pic:cNvPicPr>
                   </pic:nvPicPr>
                   <pic:blipFill>
-                    <a:blip r:embed="rId105"/>
+                    <a:blip r:embed="rId106"/>
                     <a:stretch>
                       <a:fillRect/>
                     </a:stretch>
@@ -3473,8 +3475,8 @@
         <w:t xml:space="preserve">Figure 10 (left) – MLflow experiment: candidate and final runs (two training invocations). Figure 11 (right) – Logged artefacts and model signature of the selected run.</w:t>
       </w:r>
     </w:p>
-    <w:bookmarkEnd w:id="108"/>
-    <w:bookmarkStart w:id="109" w:name="packaging-and-reproducibility"/>
+    <w:bookmarkEnd w:id="109"/>
+    <w:bookmarkStart w:id="110" w:name="packaging-and-reproducibility"/>
     <w:p>
       <w:pPr>
         <w:pStyle w:val="Heading1"/>
@@ -3795,8 +3797,8 @@
         <w:t xml:space="preserve">job runs on a clean Ubuntu runner.</w:t>
       </w:r>
     </w:p>
-    <w:bookmarkEnd w:id="109"/>
-    <w:bookmarkStart w:id="118" w:name="cicd-and-automated-testing"/>
+    <w:bookmarkEnd w:id="110"/>
+    <w:bookmarkStart w:id="119" w:name="cicd-and-automated-testing"/>
     <w:p>
       <w:pPr>
         <w:pStyle w:val="Heading1"/>
@@ -3805,7 +3807,7 @@
         <w:t xml:space="preserve">6. CI/CD and automated testing</w:t>
       </w:r>
     </w:p>
-    <w:bookmarkStart w:id="110" w:name="tests-tests-36-tests-about-1-s"/>
+    <w:bookmarkStart w:id="111" w:name="tests-tests-36-tests-about-1-s"/>
     <w:p>
       <w:pPr>
         <w:pStyle w:val="Heading2"/>
@@ -4099,8 +4101,8 @@
         <w:t xml:space="preserve">job instead.</w:t>
       </w:r>
     </w:p>
-    <w:bookmarkEnd w:id="110"/>
-    <w:bookmarkStart w:id="117" w:name="workflow-.githubworkflowsci.yml"/>
+    <w:bookmarkEnd w:id="111"/>
+    <w:bookmarkStart w:id="118" w:name="workflow-.githubworkflowsci.yml"/>
     <w:p>
       <w:pPr>
         <w:pStyle w:val="Heading2"/>
@@ -4672,18 +4674,18 @@
           <wp:inline>
             <wp:extent cx="3136392" cy="1663396"/>
             <wp:effectExtent b="0" l="0" r="0" t="0"/>
-            <wp:docPr descr="" title="" id="112" name="Picture"/>
+            <wp:docPr descr="" title="" id="113" name="Picture"/>
             <a:graphic>
               <a:graphicData uri="http://schemas.openxmlformats.org/drawingml/2006/picture">
                 <pic:pic>
                   <pic:nvPicPr>
-                    <pic:cNvPr descr="../screenshots/github_actions_run.png" id="113" name="Picture"/>
+                    <pic:cNvPr descr="../screenshots/github_actions_run.png" id="114" name="Picture"/>
                     <pic:cNvPicPr>
                       <a:picLocks noChangeArrowheads="1" noChangeAspect="1"/>
                     </pic:cNvPicPr>
                   </pic:nvPicPr>
                   <pic:blipFill>
-                    <a:blip r:embed="rId111"/>
+                    <a:blip r:embed="rId112"/>
                     <a:stretch>
                       <a:fillRect/>
                     </a:stretch>
@@ -4717,18 +4719,18 @@
           <wp:inline>
             <wp:extent cx="3136392" cy="1031487"/>
             <wp:effectExtent b="0" l="0" r="0" t="0"/>
-            <wp:docPr descr="" title="" id="115" name="Picture"/>
+            <wp:docPr descr="" title="" id="116" name="Picture"/>
             <a:graphic>
               <a:graphicData uri="http://schemas.openxmlformats.org/drawingml/2006/picture">
                 <pic:pic>
                   <pic:nvPicPr>
-                    <pic:cNvPr descr="../screenshots/github_actions_artifacts.png" id="116" name="Picture"/>
+                    <pic:cNvPr descr="../screenshots/github_actions_artifacts.png" id="117" name="Picture"/>
                     <pic:cNvPicPr>
                       <a:picLocks noChangeArrowheads="1" noChangeAspect="1"/>
                     </pic:cNvPicPr>
                   </pic:nvPicPr>
                   <pic:blipFill>
-                    <a:blip r:embed="rId114"/>
+                    <a:blip r:embed="rId115"/>
                     <a:stretch>
                       <a:fillRect/>
                     </a:stretch>
@@ -4767,9 +4769,9 @@
         <w:t xml:space="preserve">Figure 12 (left) – Green GitHub Actions run (lint → test → train → docker, plus k8s-manifests) with the training job summary. Figure 13 (right) – Artefacts produced by the run: Docker image, MLflow runs, model, test and training reports.</w:t>
       </w:r>
     </w:p>
-    <w:bookmarkEnd w:id="117"/>
     <w:bookmarkEnd w:id="118"/>
-    <w:bookmarkStart w:id="136" w:name="containerisation-and-deployment"/>
+    <w:bookmarkEnd w:id="119"/>
+    <w:bookmarkStart w:id="137" w:name="containerisation-and-deployment"/>
     <w:p>
       <w:pPr>
         <w:pStyle w:val="Heading1"/>
@@ -4778,7 +4780,7 @@
         <w:t xml:space="preserve">7. Containerisation and deployment</w:t>
       </w:r>
     </w:p>
-    <w:bookmarkStart w:id="122" w:name="container"/>
+    <w:bookmarkStart w:id="123" w:name="container"/>
     <w:p>
       <w:pPr>
         <w:pStyle w:val="Heading2"/>
@@ -5449,18 +5451,18 @@
           <wp:inline>
             <wp:extent cx="4992624" cy="1719593"/>
             <wp:effectExtent b="0" l="0" r="0" t="0"/>
-            <wp:docPr descr="Figure 14 – make docker-build, docker run and curl /predict on the lab server: high-risk sample → 1 (p = 0.997)" title="" id="120" name="Picture"/>
+            <wp:docPr descr="Figure 14 – make docker-build, docker run and curl /predict on the lab server: high-risk sample → 1 (p = 0.997)" title="" id="121" name="Picture"/>
             <a:graphic>
               <a:graphicData uri="http://schemas.openxmlformats.org/drawingml/2006/picture">
                 <pic:pic>
                   <pic:nvPicPr>
-                    <pic:cNvPr descr="../screenshots/docker_build_run.png" id="121" name="Picture"/>
+                    <pic:cNvPr descr="../screenshots/docker_build_run.png" id="122" name="Picture"/>
                     <pic:cNvPicPr>
                       <a:picLocks noChangeArrowheads="1" noChangeAspect="1"/>
                     </pic:cNvPicPr>
                   </pic:nvPicPr>
                   <pic:blipFill>
-                    <a:blip r:embed="rId119"/>
+                    <a:blip r:embed="rId120"/>
                     <a:stretch>
                       <a:fillRect/>
                     </a:stretch>
@@ -5537,8 +5539,8 @@
         <w:t xml:space="preserve">on the lab server: high-risk sample → 1 (p = 0.997)</w:t>
       </w:r>
     </w:p>
-    <w:bookmarkEnd w:id="122"/>
-    <w:bookmarkStart w:id="135" w:name="kubernetes"/>
+    <w:bookmarkEnd w:id="123"/>
+    <w:bookmarkStart w:id="136" w:name="kubernetes"/>
     <w:p>
       <w:pPr>
         <w:pStyle w:val="Heading2"/>
@@ -6328,18 +6330,18 @@
           <wp:inline>
             <wp:extent cx="3136392" cy="1737396"/>
             <wp:effectExtent b="0" l="0" r="0" t="0"/>
-            <wp:docPr descr="" title="" id="124" name="Picture"/>
+            <wp:docPr descr="" title="" id="125" name="Picture"/>
             <a:graphic>
               <a:graphicData uri="http://schemas.openxmlformats.org/drawingml/2006/picture">
                 <pic:pic>
                   <pic:nvPicPr>
-                    <pic:cNvPr descr="../screenshots/k8s_pods_services.png" id="125" name="Picture"/>
+                    <pic:cNvPr descr="../screenshots/k8s_pods_services.png" id="126" name="Picture"/>
                     <pic:cNvPicPr>
                       <a:picLocks noChangeArrowheads="1" noChangeAspect="1"/>
                     </pic:cNvPicPr>
                   </pic:nvPicPr>
                   <pic:blipFill>
-                    <a:blip r:embed="rId123"/>
+                    <a:blip r:embed="rId124"/>
                     <a:stretch>
                       <a:fillRect/>
                     </a:stretch>
@@ -6373,18 +6375,18 @@
           <wp:inline>
             <wp:extent cx="3136392" cy="1351994"/>
             <wp:effectExtent b="0" l="0" r="0" t="0"/>
-            <wp:docPr descr="" title="" id="127" name="Picture"/>
+            <wp:docPr descr="" title="" id="128" name="Picture"/>
             <a:graphic>
               <a:graphicData uri="http://schemas.openxmlformats.org/drawingml/2006/picture">
                 <pic:pic>
                   <pic:nvPicPr>
-                    <pic:cNvPr descr="../screenshots/k8s_smoke_load_test.png" id="128" name="Picture"/>
+                    <pic:cNvPr descr="../screenshots/k8s_smoke_load_test.png" id="129" name="Picture"/>
                     <pic:cNvPicPr>
                       <a:picLocks noChangeArrowheads="1" noChangeAspect="1"/>
                     </pic:cNvPicPr>
                   </pic:nvPicPr>
                   <pic:blipFill>
-                    <a:blip r:embed="rId126"/>
+                    <a:blip r:embed="rId127"/>
                     <a:stretch>
                       <a:fillRect/>
                     </a:stretch>
@@ -6483,18 +6485,18 @@
           <wp:inline>
             <wp:extent cx="3328416" cy="1202266"/>
             <wp:effectExtent b="0" l="0" r="0" t="0"/>
-            <wp:docPr descr="" title="" id="130" name="Picture"/>
+            <wp:docPr descr="" title="" id="131" name="Picture"/>
             <a:graphic>
               <a:graphicData uri="http://schemas.openxmlformats.org/drawingml/2006/picture">
                 <pic:pic>
                   <pic:nvPicPr>
-                    <pic:cNvPr descr="../screenshots/api_server.png" id="131" name="Picture"/>
+                    <pic:cNvPr descr="../screenshots/api_server.png" id="132" name="Picture"/>
                     <pic:cNvPicPr>
                       <a:picLocks noChangeArrowheads="1" noChangeAspect="1"/>
                     </pic:cNvPicPr>
                   </pic:nvPicPr>
                   <pic:blipFill>
-                    <a:blip r:embed="rId129"/>
+                    <a:blip r:embed="rId130"/>
                     <a:stretch>
                       <a:fillRect/>
                     </a:stretch>
@@ -6528,18 +6530,18 @@
           <wp:inline>
             <wp:extent cx="2944368" cy="434322"/>
             <wp:effectExtent b="0" l="0" r="0" t="0"/>
-            <wp:docPr descr="" title="" id="133" name="Picture"/>
+            <wp:docPr descr="" title="" id="134" name="Picture"/>
             <a:graphic>
               <a:graphicData uri="http://schemas.openxmlformats.org/drawingml/2006/picture">
                 <pic:pic>
                   <pic:nvPicPr>
-                    <pic:cNvPr descr="../screenshots/pods_autoscaler.png" id="134" name="Picture"/>
+                    <pic:cNvPr descr="../screenshots/pods_autoscaler.png" id="135" name="Picture"/>
                     <pic:cNvPicPr>
                       <a:picLocks noChangeArrowheads="1" noChangeAspect="1"/>
                     </pic:cNvPicPr>
                   </pic:nvPicPr>
                   <pic:blipFill>
-                    <a:blip r:embed="rId132"/>
+                    <a:blip r:embed="rId133"/>
                     <a:stretch>
                       <a:fillRect/>
                     </a:stretch>
@@ -6607,9 +6609,9 @@
         <w:t xml:space="preserve">during load: CPU rises from 9 % to 113 % of the request and the HPA scales from 2 to 4 replicas, then CPU settles back to 17 %.</w:t>
       </w:r>
     </w:p>
-    <w:bookmarkEnd w:id="135"/>
     <w:bookmarkEnd w:id="136"/>
-    <w:bookmarkStart w:id="143" w:name="monitoring-and-logging"/>
+    <w:bookmarkEnd w:id="137"/>
+    <w:bookmarkStart w:id="144" w:name="monitoring-and-logging"/>
     <w:p>
       <w:pPr>
         <w:pStyle w:val="Heading1"/>
@@ -7132,18 +7134,18 @@
           <wp:inline>
             <wp:extent cx="4352544" cy="1490597"/>
             <wp:effectExtent b="0" l="0" r="0" t="0"/>
-            <wp:docPr descr="Figure 19 – Prometheus scraping both API pods separately (heart_api_predictions_total per pod, instance and risk band)" title="" id="138" name="Picture"/>
+            <wp:docPr descr="Figure 19 – Prometheus scraping both API pods separately (heart_api_predictions_total per pod, instance and risk band)" title="" id="139" name="Picture"/>
             <a:graphic>
               <a:graphicData uri="http://schemas.openxmlformats.org/drawingml/2006/picture">
                 <pic:pic>
                   <pic:nvPicPr>
-                    <pic:cNvPr descr="../screenshots/prometheus_targets.png" id="139" name="Picture"/>
+                    <pic:cNvPr descr="../screenshots/prometheus_targets.png" id="140" name="Picture"/>
                     <pic:cNvPicPr>
                       <a:picLocks noChangeArrowheads="1" noChangeAspect="1"/>
                     </pic:cNvPicPr>
                   </pic:nvPicPr>
                   <pic:blipFill>
-                    <a:blip r:embed="rId137"/>
+                    <a:blip r:embed="rId138"/>
                     <a:stretch>
                       <a:fillRect/>
                     </a:stretch>
@@ -7199,18 +7201,18 @@
           <wp:inline>
             <wp:extent cx="4992624" cy="2630043"/>
             <wp:effectExtent b="0" l="0" r="0" t="0"/>
-            <wp:docPr descr="Figure 20 – Grafana Heart Risk API dashboard after the load tests: about 8.1 k predictions, p95 latency around 15 ms, no 5xx errors, 44 % positive share and the predicted-probability distribution" title="" id="141" name="Picture"/>
+            <wp:docPr descr="Figure 20 – Grafana Heart Risk API dashboard after the load tests: about 8.1 k predictions, p95 latency around 15 ms, no 5xx errors, 44 % positive share and the predicted-probability distribution" title="" id="142" name="Picture"/>
             <a:graphic>
               <a:graphicData uri="http://schemas.openxmlformats.org/drawingml/2006/picture">
                 <pic:pic>
                   <pic:nvPicPr>
-                    <pic:cNvPr descr="../screenshots/grafana_dashboard.png" id="142" name="Picture"/>
+                    <pic:cNvPr descr="../screenshots/grafana_dashboard.png" id="143" name="Picture"/>
                     <pic:cNvPicPr>
                       <a:picLocks noChangeArrowheads="1" noChangeAspect="1"/>
                     </pic:cNvPicPr>
                   </pic:nvPicPr>
                   <pic:blipFill>
-                    <a:blip r:embed="rId140"/>
+                    <a:blip r:embed="rId141"/>
                     <a:stretch>
                       <a:fillRect/>
                     </a:stretch>
@@ -7261,8 +7263,8 @@
         <w:t xml:space="preserve">dashboard after the load tests: about 8.1 k predictions, p95 latency around 15 ms, no 5xx errors, 44 % positive share and the predicted-probability distribution</w:t>
       </w:r>
     </w:p>
-    <w:bookmarkEnd w:id="143"/>
-    <w:bookmarkStart w:id="144" w:name="reflections-and-next-steps"/>
+    <w:bookmarkEnd w:id="144"/>
+    <w:bookmarkStart w:id="145" w:name="reflections-and-next-steps"/>
     <w:p>
       <w:pPr>
         <w:pStyle w:val="Heading1"/>
@@ -7352,8 +7354,8 @@
         <w:t xml:space="preserve">Push the image to a registry and add a CD job that deploys to a cloud cluster; use a shared MLflow server with registry stage transitions as the promotion gate; add calibration (Platt or isotonic) and SHAP explanations in the API response; build a scheduled drift job that compares logged inputs with the training distribution (PSI or KS) and triggers retraining.</w:t>
       </w:r>
     </w:p>
-    <w:bookmarkEnd w:id="144"/>
-    <w:bookmarkStart w:id="145" w:name="appendix-a-reproduce-everything"/>
+    <w:bookmarkEnd w:id="145"/>
+    <w:bookmarkStart w:id="146" w:name="appendix-a-reproduce-everything"/>
     <w:p>
       <w:pPr>
         <w:pStyle w:val="Heading1"/>
@@ -7616,7 +7618,7 @@
         <w:t xml:space="preserve"># http://localhost:5000</w:t>
       </w:r>
     </w:p>
-    <w:bookmarkEnd w:id="145"/>
+    <w:bookmarkEnd w:id="146"/>
     <w:sectPr>
       <w:footnotePr>
         <w:numRestart w:val="eachSect"/>

</xml_diff>